<commit_message>
Fix report template layout and footer fidelity
</commit_message>
<xml_diff>
--- a/final_report.docx
+++ b/final_report.docx
@@ -836,12 +836,47 @@
       <w:pPr>
         <w:pStyle w:val="PARAGRAPH"/>
         <w:ind w:firstLine="317"/>
+        <w:jc w:val="left"/>
         <w:rPr>
           <w:rFonts w:ascii="Times New Roman" w:hAnsi="Times New Roman"/>
           <w:sz w:val="20"/>
           <w:lang w:val="en-GB"/>
         </w:rPr>
       </w:pPr>
+      <w:r>
+        <w:drawing>
+          <wp:inline xmlns:a="http://schemas.openxmlformats.org/drawingml/2006/main" xmlns:pic="http://schemas.openxmlformats.org/drawingml/2006/picture">
+            <wp:extent cx="1051560" cy="920115"/>
+            <wp:docPr id="1" name="Picture 1"/>
+            <wp:cNvGraphicFramePr>
+              <a:graphicFrameLocks noChangeAspect="1"/>
+            </wp:cNvGraphicFramePr>
+            <a:graphic>
+              <a:graphicData uri="http://schemas.openxmlformats.org/drawingml/2006/picture">
+                <pic:pic>
+                  <pic:nvPicPr>
+                    <pic:cNvPr id="0" name="image.png"/>
+                    <pic:cNvPicPr/>
+                  </pic:nvPicPr>
+                  <pic:blipFill>
+                    <a:blip r:embed="rId14"/>
+                    <a:stretch>
+                      <a:fillRect/>
+                    </a:stretch>
+                  </pic:blipFill>
+                  <pic:spPr>
+                    <a:xfrm>
+                      <a:off x="0" y="0"/>
+                      <a:ext cx="1051560" cy="920115"/>
+                    </a:xfrm>
+                    <a:prstGeom prst="rect"/>
+                  </pic:spPr>
+                </pic:pic>
+              </a:graphicData>
+            </a:graphic>
+          </wp:inline>
+        </w:drawing>
+      </w:r>
     </w:p>
     <w:p>
       <w:pPr>
@@ -884,30 +919,6 @@
           <w:sz w:val="20"/>
           <w:lang w:val="en-GB"/>
         </w:rPr>
-        <w:pict w14:anchorId="10ED39A4">
-          <v:shapetype id="_x0000_t75" coordsize="21600,21600" o:spt="75" o:preferrelative="t" path="m@4@5l@4@11@9@11@9@5xe" filled="f" stroked="f">
-            <v:stroke joinstyle="miter"/>
-            <v:formulas>
-              <v:f eqn="if lineDrawn pixelLineWidth 0"/>
-              <v:f eqn="sum @0 1 0"/>
-              <v:f eqn="sum 0 0 @1"/>
-              <v:f eqn="prod @2 1 2"/>
-              <v:f eqn="prod @3 21600 pixelWidth"/>
-              <v:f eqn="prod @3 21600 pixelHeight"/>
-              <v:f eqn="sum @0 0 1"/>
-              <v:f eqn="prod @6 1 2"/>
-              <v:f eqn="prod @7 21600 pixelWidth"/>
-              <v:f eqn="sum @8 21600 0"/>
-              <v:f eqn="prod @7 21600 pixelHeight"/>
-              <v:f eqn="sum @10 21600 0"/>
-            </v:formulas>
-            <v:path o:extrusionok="f" gradientshapeok="t" o:connecttype="rect"/>
-            <o:lock v:ext="edit" aspectratio="t"/>
-          </v:shapetype>
-          <v:shape id="_x0000_i1025" type="#_x0000_t75" style="width:113pt;height:85pt">
-            <v:imagedata r:id="rId14" o:title="confusion_matrix"/>
-          </v:shape>
-        </w:pict>
       </w:r>
     </w:p>
     <w:p>
@@ -1263,12 +1274,7 @@
         </w:sectPr>
       </w:pPr>
       <w:r>
-        <w:rPr>
-          <w:rFonts w:ascii="Times New Roman" w:hAnsi="Times New Roman"/>
-          <w:sz w:val="20"/>
-          <w:lang w:val="en-GB"/>
-        </w:rPr>
-        <w:t>GitHub: [PLACEHOLDER: Enter your GitHub repository link]</w:t>
+        <w:t>GitHub: https://github.com/tonglynn/in6227-tabular-classification-skill</w:t>
       </w:r>
     </w:p>
     <w:p>
@@ -1336,7 +1342,7 @@
         <w:sz w:val="18"/>
         <w:szCs w:val="18"/>
       </w:rPr>
-      <w:t>IN6227 Assignment 1, Variant 2: Tabular Classification SKILL</w:t>
+      <w:t>IN6227 ASSIGNMENT 1, VARIANT 2</w:t>
     </w:r>
   </w:p>
   <w:p>

</xml_diff>

<commit_message>
Restore two-page template flow and footer alignment
</commit_message>
<xml_diff>
--- a/final_report.docx
+++ b/final_report.docx
@@ -843,40 +843,7 @@
           <w:lang w:val="en-GB"/>
         </w:rPr>
       </w:pPr>
-      <w:r>
-        <w:drawing>
-          <wp:inline xmlns:a="http://schemas.openxmlformats.org/drawingml/2006/main" xmlns:pic="http://schemas.openxmlformats.org/drawingml/2006/picture">
-            <wp:extent cx="1051560" cy="920115"/>
-            <wp:docPr id="1" name="Picture 1"/>
-            <wp:cNvGraphicFramePr>
-              <a:graphicFrameLocks noChangeAspect="1"/>
-            </wp:cNvGraphicFramePr>
-            <a:graphic>
-              <a:graphicData uri="http://schemas.openxmlformats.org/drawingml/2006/picture">
-                <pic:pic>
-                  <pic:nvPicPr>
-                    <pic:cNvPr id="0" name="image.png"/>
-                    <pic:cNvPicPr/>
-                  </pic:nvPicPr>
-                  <pic:blipFill>
-                    <a:blip r:embed="rId14"/>
-                    <a:stretch>
-                      <a:fillRect/>
-                    </a:stretch>
-                  </pic:blipFill>
-                  <pic:spPr>
-                    <a:xfrm>
-                      <a:off x="0" y="0"/>
-                      <a:ext cx="1051560" cy="920115"/>
-                    </a:xfrm>
-                    <a:prstGeom prst="rect"/>
-                  </pic:spPr>
-                </pic:pic>
-              </a:graphicData>
-            </a:graphic>
-          </wp:inline>
-        </w:drawing>
-      </w:r>
+      <w:r/>
     </w:p>
     <w:p>
       <w:pPr>
@@ -1318,7 +1285,21 @@
   <w:p>
     <w:pPr>
       <w:pStyle w:val="a8"/>
+      <w:tabs>
+        <w:tab w:pos="9000" w:val="right"/>
+      </w:tabs>
     </w:pPr>
+    <w:r/>
+    <w:r>
+      <w:rPr>
+        <w:rFonts w:ascii="Times New Roman" w:hAnsi="Times New Roman"/>
+        <w:color w:val="4472C4"/>
+        <w:sz w:val="18"/>
+      </w:rPr>
+      <w:t>IN6227 ASSIGNMENT 1, VARIANT 2</w:t>
+      <w:tab/>
+      <w:t>LIN TONG, G2608825L</w:t>
+    </w:r>
   </w:p>
 </w:ftr>
 </file>
@@ -1328,6 +1309,9 @@
   <w:p>
     <w:pPr>
       <w:pStyle w:val="a8"/>
+      <w:tabs>
+        <w:tab w:pos="9000" w:val="right"/>
+      </w:tabs>
       <w:rPr>
         <w:caps/>
         <w:color w:val="4472C4"/>
@@ -1335,79 +1319,17 @@
         <w:szCs w:val="18"/>
       </w:rPr>
     </w:pPr>
+    <w:r/>
     <w:r>
       <w:rPr>
-        <w:caps/>
+        <w:rFonts w:ascii="Times New Roman" w:hAnsi="Times New Roman"/>
         <w:color w:val="4472C4"/>
         <w:sz w:val="18"/>
-        <w:szCs w:val="18"/>
       </w:rPr>
       <w:t>IN6227 ASSIGNMENT 1, VARIANT 2</w:t>
-    </w:r>
-  </w:p>
-  <w:p>
-    <w:pPr>
-      <w:pStyle w:val="a8"/>
-      <w:rPr>
-        <w:caps/>
-        <w:color w:val="4472C4"/>
-        <w:sz w:val="18"/>
-        <w:szCs w:val="18"/>
-      </w:rPr>
-    </w:pPr>
-  </w:p>
-  <w:p>
-    <w:pPr>
-      <w:pStyle w:val="a8"/>
-      <w:rPr>
-        <w:caps/>
-        <w:color w:val="4472C4"/>
-        <w:sz w:val="18"/>
-        <w:szCs w:val="18"/>
-      </w:rPr>
-    </w:pPr>
-    <w:r>
-      <w:rPr>
-        <w:caps/>
-        <w:color w:val="4472C4"/>
-        <w:sz w:val="18"/>
-        <w:szCs w:val="18"/>
-      </w:rPr>
+      <w:tab/>
       <w:t>LIN TONG, G2608825L</w:t>
     </w:r>
-  </w:p>
-  <w:p>
-    <w:pPr>
-      <w:pStyle w:val="a8"/>
-      <w:rPr>
-        <w:caps/>
-        <w:color w:val="4472C4"/>
-        <w:sz w:val="18"/>
-        <w:szCs w:val="18"/>
-      </w:rPr>
-    </w:pPr>
-  </w:p>
-  <w:p>
-    <w:pPr>
-      <w:pStyle w:val="a8"/>
-      <w:rPr>
-        <w:caps/>
-        <w:color w:val="4472C4"/>
-        <w:sz w:val="18"/>
-        <w:szCs w:val="18"/>
-      </w:rPr>
-    </w:pPr>
-  </w:p>
-  <w:p>
-    <w:pPr>
-      <w:pStyle w:val="a8"/>
-      <w:rPr>
-        <w:rFonts w:ascii="Calibri" w:hAnsi="Calibri" w:cs="Calibri"/>
-        <w:color w:val="A6A6A6"/>
-        <w:sz w:val="18"/>
-        <w:szCs w:val="18"/>
-      </w:rPr>
-    </w:pPr>
   </w:p>
 </w:ftr>
 </file>
@@ -1417,34 +1339,24 @@
   <w:p>
     <w:pPr>
       <w:pStyle w:val="a8"/>
+      <w:tabs>
+        <w:tab w:pos="9000" w:val="right"/>
+      </w:tabs>
       <w:rPr>
         <w:rFonts w:ascii="Calibri" w:hAnsi="Calibri" w:cs="Calibri"/>
         <w:color w:val="A6A6A6"/>
       </w:rPr>
     </w:pPr>
+    <w:r/>
     <w:r>
       <w:rPr>
-        <w:rFonts w:ascii="Calibri" w:hAnsi="Calibri" w:cs="Calibri"/>
-        <w:color w:val="A6A6A6"/>
-      </w:rPr>
-      <w:t>Wee Kim Wee School of Communication and Information</w:t>
-    </w:r>
-  </w:p>
-  <w:p>
-    <w:pPr>
-      <w:pStyle w:val="a8"/>
-      <w:rPr>
-        <w:rFonts w:ascii="Calibri" w:hAnsi="Calibri" w:cs="Calibri"/>
-        <w:color w:val="A6A6A6"/>
-        <w:lang w:val="en-SG"/>
-      </w:rPr>
-    </w:pPr>
-    <w:r>
-      <w:rPr>
-        <w:rFonts w:ascii="Calibri" w:hAnsi="Calibri" w:cs="Calibri"/>
-        <w:color w:val="A6A6A6"/>
-      </w:rPr>
-      <w:t xml:space="preserve"> (WKWSCI)</w:t>
+        <w:rFonts w:ascii="Times New Roman" w:hAnsi="Times New Roman"/>
+        <w:color w:val="4472C4"/>
+        <w:sz w:val="18"/>
+      </w:rPr>
+      <w:t>IN6227 ASSIGNMENT 1, VARIANT 2</w:t>
+      <w:tab/>
+      <w:t>LIN TONG, G2608825L</w:t>
     </w:r>
   </w:p>
 </w:ftr>

</xml_diff>

<commit_message>
Restore confusion matrix figure in final report
</commit_message>
<xml_diff>
--- a/final_report.docx
+++ b/final_report.docx
@@ -21,7 +21,7 @@
           <w:szCs w:val="48"/>
           <w:lang w:val="en-GB"/>
         </w:rPr>
-        <w:t>IN6227 Assignment 1, Variant 2: Tabular Classification SKILL</w:t>
+        <w:t>Tabular Classification</w:t>
       </w:r>
     </w:p>
     <w:p>
@@ -41,13 +41,6 @@
           <w:lang w:val="en-GB"/>
         </w:rPr>
         <w:t>LIN TONG, G2608825L</w:t>
-      </w:r>
-      <w:r>
-        <w:rPr>
-          <w:rFonts w:ascii="Times New Roman" w:hAnsi="Times New Roman"/>
-          <w:color w:val="000000"/>
-          <w:lang w:val="en-GB"/>
-        </w:rPr>
         <w:br/>
         <w:t>IN6227-2023-Assignment-1</w:t>
       </w:r>
@@ -78,10 +71,10 @@
         <w:sectPr>
           <w:headerReference w:type="even" r:id="rId8"/>
           <w:headerReference w:type="default" r:id="rId9"/>
-          <w:footerReference w:type="even" r:id="rId10"/>
-          <w:footerReference w:type="default" r:id="rId11"/>
-          <w:headerReference w:type="first" r:id="rId12"/>
-          <w:footerReference w:type="first" r:id="rId13"/>
+          <w:footerReference w:type="default" r:id="rId10"/>
+          <w:headerReference w:type="first" r:id="rId11"/>
+          <w:footerReference w:type="first" r:id="rId12"/>
+          <w:footerReference w:type="even" r:id="rId15"/>
           <w:pgSz w:w="11906" w:h="16838" w:code="9"/>
           <w:pgMar w:top="1440" w:right="1080" w:bottom="1440" w:left="1080" w:header="709" w:footer="709" w:gutter="0"/>
           <w:pgNumType w:start="1"/>
@@ -155,6 +148,13 @@
           <w:lang w:val="en-GB"/>
         </w:rPr>
       </w:pPr>
+      <w:r>
+        <w:rPr>
+          <w:rFonts w:ascii="Times New Roman" w:hAnsi="Times New Roman"/>
+          <w:sz w:val="20"/>
+          <w:lang w:val="en-GB"/>
+        </w:rPr>
+      </w:r>
     </w:p>
     <w:p>
       <w:pPr>
@@ -273,6 +273,8 @@
           <w:lang w:val="en-GB"/>
         </w:rPr>
       </w:pPr>
+      <w:bookmarkStart w:id="2" w:name="_Hlk506313215"/>
+      <w:bookmarkEnd w:id="2"/>
       <w:r>
         <w:rPr>
           <w:rFonts w:ascii="Times New Roman" w:hAnsi="Times New Roman"/>
@@ -282,624 +284,119 @@
         </w:rPr>
         <w:t>Test-set performance (best model: random_forest): accuracy=0.8272, precision=0.6177, recall=0.7156, F1=0.6631, ROC-AUC=0.8887, PR-AUC=0.7010.</w:t>
       </w:r>
+      <w:r>
+        <w:t xml:space="preserve"> CV comparison: dummy F1=0.235, logistic regression F1=0.660, random forest F1=0.664, gradient boosting F1=0.626.</w:t>
+      </w:r>
     </w:p>
-    <w:tbl>
-      <w:tblPr>
-        <w:tblW w:w="4600" w:type="dxa"/>
-        <w:tblBorders>
-          <w:top w:val="single" w:sz="4" w:space="0" w:color="auto"/>
-          <w:left w:val="single" w:sz="4" w:space="0" w:color="auto"/>
-          <w:bottom w:val="single" w:sz="4" w:space="0" w:color="auto"/>
-          <w:right w:val="single" w:sz="4" w:space="0" w:color="auto"/>
-          <w:insideH w:val="single" w:sz="4" w:space="0" w:color="auto"/>
-          <w:insideV w:val="single" w:sz="4" w:space="0" w:color="auto"/>
-        </w:tblBorders>
-        <w:tblLayout w:type="fixed"/>
-        <w:tblLook w:val="0000" w:firstRow="0" w:lastRow="0" w:firstColumn="0" w:lastColumn="0" w:noHBand="0" w:noVBand="0"/>
-      </w:tblPr>
-      <w:tblGrid>
-        <w:gridCol w:w="1600"/>
-        <w:gridCol w:w="1000"/>
-        <w:gridCol w:w="1000"/>
-        <w:gridCol w:w="1000"/>
-      </w:tblGrid>
-      <w:tr>
-        <w:tblPrEx>
-          <w:tblCellMar>
-            <w:top w:w="0" w:type="dxa"/>
-            <w:bottom w:w="0" w:type="dxa"/>
-          </w:tblCellMar>
-        </w:tblPrEx>
-        <w:tc>
-          <w:tcPr>
-            <w:tcW w:w="1600" w:type="dxa"/>
-          </w:tcPr>
-          <w:p>
-            <w:pPr>
-              <w:pStyle w:val="PARAGRAPH"/>
-              <w:ind w:firstLine="0"/>
-              <w:rPr>
-                <w:rFonts w:ascii="Times New Roman" w:hAnsi="Times New Roman"/>
-                <w:b/>
-                <w:sz w:val="18"/>
-                <w:lang w:val="en-GB"/>
-              </w:rPr>
-            </w:pPr>
-            <w:r>
-              <w:rPr>
-                <w:rFonts w:ascii="Times New Roman" w:hAnsi="Times New Roman"/>
-                <w:b/>
-                <w:sz w:val="18"/>
-                <w:lang w:val="en-GB"/>
-              </w:rPr>
-              <w:t>Model</w:t>
-            </w:r>
-          </w:p>
-        </w:tc>
-        <w:tc>
-          <w:tcPr>
-            <w:tcW w:w="1000" w:type="dxa"/>
-          </w:tcPr>
-          <w:p>
-            <w:pPr>
-              <w:pStyle w:val="PARAGRAPH"/>
-              <w:ind w:firstLine="0"/>
-              <w:rPr>
-                <w:rFonts w:ascii="Times New Roman" w:hAnsi="Times New Roman"/>
-                <w:b/>
-                <w:sz w:val="18"/>
-                <w:lang w:val="en-GB"/>
-              </w:rPr>
-            </w:pPr>
-            <w:r>
-              <w:rPr>
-                <w:rFonts w:ascii="Times New Roman" w:hAnsi="Times New Roman"/>
-                <w:b/>
-                <w:sz w:val="18"/>
-                <w:lang w:val="en-GB"/>
-              </w:rPr>
-              <w:t>Acc</w:t>
-            </w:r>
-          </w:p>
-        </w:tc>
-        <w:tc>
-          <w:tcPr>
-            <w:tcW w:w="1000" w:type="dxa"/>
-          </w:tcPr>
-          <w:p>
-            <w:pPr>
-              <w:pStyle w:val="PARAGRAPH"/>
-              <w:ind w:firstLine="0"/>
-              <w:rPr>
-                <w:rFonts w:ascii="Times New Roman" w:hAnsi="Times New Roman"/>
-                <w:b/>
-                <w:sz w:val="18"/>
-                <w:lang w:val="en-GB"/>
-              </w:rPr>
-            </w:pPr>
-            <w:r>
-              <w:rPr>
-                <w:rFonts w:ascii="Times New Roman" w:hAnsi="Times New Roman"/>
-                <w:b/>
-                <w:sz w:val="18"/>
-                <w:lang w:val="en-GB"/>
-              </w:rPr>
-              <w:t>F1</w:t>
-            </w:r>
-          </w:p>
-        </w:tc>
-        <w:tc>
-          <w:tcPr>
-            <w:tcW w:w="1000" w:type="dxa"/>
-          </w:tcPr>
-          <w:p>
-            <w:pPr>
-              <w:pStyle w:val="PARAGRAPH"/>
-              <w:ind w:firstLine="0"/>
-              <w:rPr>
-                <w:rFonts w:ascii="Times New Roman" w:hAnsi="Times New Roman"/>
-                <w:b/>
-                <w:sz w:val="18"/>
-                <w:lang w:val="en-GB"/>
-              </w:rPr>
-            </w:pPr>
-            <w:r>
-              <w:rPr>
-                <w:rFonts w:ascii="Times New Roman" w:hAnsi="Times New Roman"/>
-                <w:b/>
-                <w:sz w:val="18"/>
-                <w:lang w:val="en-GB"/>
-              </w:rPr>
-              <w:t>AUC</w:t>
-            </w:r>
-          </w:p>
-        </w:tc>
-      </w:tr>
-      <w:tr>
-        <w:tblPrEx>
-          <w:tblCellMar>
-            <w:top w:w="0" w:type="dxa"/>
-            <w:bottom w:w="0" w:type="dxa"/>
-          </w:tblCellMar>
-        </w:tblPrEx>
-        <w:tc>
-          <w:tcPr>
-            <w:tcW w:w="1600" w:type="dxa"/>
-          </w:tcPr>
-          <w:p>
-            <w:pPr>
-              <w:pStyle w:val="PARAGRAPH"/>
-              <w:ind w:firstLine="0"/>
-              <w:rPr>
-                <w:rFonts w:ascii="Times New Roman" w:hAnsi="Times New Roman"/>
-                <w:sz w:val="18"/>
-                <w:lang w:val="en-GB"/>
-              </w:rPr>
-            </w:pPr>
-            <w:r>
-              <w:rPr>
-                <w:rFonts w:ascii="Times New Roman" w:hAnsi="Times New Roman"/>
-                <w:sz w:val="18"/>
-                <w:lang w:val="en-GB"/>
-              </w:rPr>
-              <w:t>dummy</w:t>
-            </w:r>
-          </w:p>
-        </w:tc>
-        <w:tc>
-          <w:tcPr>
-            <w:tcW w:w="1000" w:type="dxa"/>
-          </w:tcPr>
-          <w:p>
-            <w:pPr>
-              <w:pStyle w:val="PARAGRAPH"/>
-              <w:ind w:firstLine="0"/>
-              <w:rPr>
-                <w:rFonts w:ascii="Times New Roman" w:hAnsi="Times New Roman"/>
-                <w:sz w:val="18"/>
-                <w:lang w:val="en-GB"/>
-              </w:rPr>
-            </w:pPr>
-            <w:r>
-              <w:rPr>
-                <w:rFonts w:ascii="Times New Roman" w:hAnsi="Times New Roman"/>
-                <w:sz w:val="18"/>
-                <w:lang w:val="en-GB"/>
-              </w:rPr>
-              <w:t>0.635</w:t>
-            </w:r>
-          </w:p>
-        </w:tc>
-        <w:tc>
-          <w:tcPr>
-            <w:tcW w:w="1000" w:type="dxa"/>
-          </w:tcPr>
-          <w:p>
-            <w:pPr>
-              <w:pStyle w:val="PARAGRAPH"/>
-              <w:ind w:firstLine="0"/>
-              <w:rPr>
-                <w:rFonts w:ascii="Times New Roman" w:hAnsi="Times New Roman"/>
-                <w:sz w:val="18"/>
-                <w:lang w:val="en-GB"/>
-              </w:rPr>
-            </w:pPr>
-            <w:r>
-              <w:rPr>
-                <w:rFonts w:ascii="Times New Roman" w:hAnsi="Times New Roman"/>
-                <w:sz w:val="18"/>
-                <w:lang w:val="en-GB"/>
-              </w:rPr>
-              <w:t>0.235</w:t>
-            </w:r>
-          </w:p>
-        </w:tc>
-        <w:tc>
-          <w:tcPr>
-            <w:tcW w:w="1000" w:type="dxa"/>
-          </w:tcPr>
-          <w:p>
-            <w:pPr>
-              <w:pStyle w:val="PARAGRAPH"/>
-              <w:ind w:firstLine="0"/>
-              <w:rPr>
-                <w:rFonts w:ascii="Times New Roman" w:hAnsi="Times New Roman"/>
-                <w:sz w:val="18"/>
-                <w:lang w:val="en-GB"/>
-              </w:rPr>
-            </w:pPr>
-            <w:r>
-              <w:rPr>
-                <w:rFonts w:ascii="Times New Roman" w:hAnsi="Times New Roman"/>
-                <w:sz w:val="18"/>
-                <w:lang w:val="en-GB"/>
-              </w:rPr>
-              <w:t>0.498</w:t>
-            </w:r>
-          </w:p>
-        </w:tc>
-      </w:tr>
-      <w:tr>
-        <w:tblPrEx>
-          <w:tblCellMar>
-            <w:top w:w="0" w:type="dxa"/>
-            <w:bottom w:w="0" w:type="dxa"/>
-          </w:tblCellMar>
-        </w:tblPrEx>
-        <w:tc>
-          <w:tcPr>
-            <w:tcW w:w="1600" w:type="dxa"/>
-          </w:tcPr>
-          <w:p>
-            <w:pPr>
-              <w:pStyle w:val="PARAGRAPH"/>
-              <w:ind w:firstLine="0"/>
-              <w:rPr>
-                <w:rFonts w:ascii="Times New Roman" w:hAnsi="Times New Roman"/>
-                <w:sz w:val="18"/>
-                <w:lang w:val="en-GB"/>
-              </w:rPr>
-            </w:pPr>
-            <w:r>
-              <w:rPr>
-                <w:rFonts w:ascii="Times New Roman" w:hAnsi="Times New Roman"/>
-                <w:sz w:val="18"/>
-                <w:lang w:val="en-GB"/>
-              </w:rPr>
-              <w:t>log_reg</w:t>
-            </w:r>
-          </w:p>
-        </w:tc>
-        <w:tc>
-          <w:tcPr>
-            <w:tcW w:w="1000" w:type="dxa"/>
-          </w:tcPr>
-          <w:p>
-            <w:pPr>
-              <w:pStyle w:val="PARAGRAPH"/>
-              <w:ind w:firstLine="0"/>
-              <w:rPr>
-                <w:rFonts w:ascii="Times New Roman" w:hAnsi="Times New Roman"/>
-                <w:sz w:val="18"/>
-                <w:lang w:val="en-GB"/>
-              </w:rPr>
-            </w:pPr>
-            <w:r>
-              <w:rPr>
-                <w:rFonts w:ascii="Times New Roman" w:hAnsi="Times New Roman"/>
-                <w:sz w:val="18"/>
-                <w:lang w:val="en-GB"/>
-              </w:rPr>
-              <w:t>0.790</w:t>
-            </w:r>
-          </w:p>
-        </w:tc>
-        <w:tc>
-          <w:tcPr>
-            <w:tcW w:w="1000" w:type="dxa"/>
-          </w:tcPr>
-          <w:p>
-            <w:pPr>
-              <w:pStyle w:val="PARAGRAPH"/>
-              <w:ind w:firstLine="0"/>
-              <w:rPr>
-                <w:rFonts w:ascii="Times New Roman" w:hAnsi="Times New Roman"/>
-                <w:sz w:val="18"/>
-                <w:lang w:val="en-GB"/>
-              </w:rPr>
-            </w:pPr>
-            <w:r>
-              <w:rPr>
-                <w:rFonts w:ascii="Times New Roman" w:hAnsi="Times New Roman"/>
-                <w:sz w:val="18"/>
-                <w:lang w:val="en-GB"/>
-              </w:rPr>
-              <w:t>0.660</w:t>
-            </w:r>
-          </w:p>
-        </w:tc>
-        <w:tc>
-          <w:tcPr>
-            <w:tcW w:w="1000" w:type="dxa"/>
-          </w:tcPr>
-          <w:p>
-            <w:pPr>
-              <w:pStyle w:val="PARAGRAPH"/>
-              <w:ind w:firstLine="0"/>
-              <w:rPr>
-                <w:rFonts w:ascii="Times New Roman" w:hAnsi="Times New Roman"/>
-                <w:sz w:val="18"/>
-                <w:lang w:val="en-GB"/>
-              </w:rPr>
-            </w:pPr>
-            <w:r>
-              <w:rPr>
-                <w:rFonts w:ascii="Times New Roman" w:hAnsi="Times New Roman"/>
-                <w:sz w:val="18"/>
-                <w:lang w:val="en-GB"/>
-              </w:rPr>
-              <w:t>0.890</w:t>
-            </w:r>
-          </w:p>
-        </w:tc>
-      </w:tr>
-      <w:tr>
-        <w:tblPrEx>
-          <w:tblCellMar>
-            <w:top w:w="0" w:type="dxa"/>
-            <w:bottom w:w="0" w:type="dxa"/>
-          </w:tblCellMar>
-        </w:tblPrEx>
-        <w:tc>
-          <w:tcPr>
-            <w:tcW w:w="1600" w:type="dxa"/>
-          </w:tcPr>
-          <w:p>
-            <w:pPr>
-              <w:pStyle w:val="PARAGRAPH"/>
-              <w:ind w:firstLine="0"/>
-              <w:rPr>
-                <w:rFonts w:ascii="Times New Roman" w:hAnsi="Times New Roman"/>
-                <w:sz w:val="18"/>
-                <w:lang w:val="en-GB"/>
-              </w:rPr>
-            </w:pPr>
-            <w:r>
-              <w:rPr>
-                <w:rFonts w:ascii="Times New Roman" w:hAnsi="Times New Roman"/>
-                <w:sz w:val="18"/>
-                <w:lang w:val="en-GB"/>
-              </w:rPr>
-              <w:t>random_forest*</w:t>
-            </w:r>
-          </w:p>
-        </w:tc>
-        <w:tc>
-          <w:tcPr>
-            <w:tcW w:w="1000" w:type="dxa"/>
-          </w:tcPr>
-          <w:p>
-            <w:pPr>
-              <w:pStyle w:val="PARAGRAPH"/>
-              <w:ind w:firstLine="0"/>
-              <w:rPr>
-                <w:rFonts w:ascii="Times New Roman" w:hAnsi="Times New Roman"/>
-                <w:sz w:val="18"/>
-                <w:lang w:val="en-GB"/>
-              </w:rPr>
-            </w:pPr>
-            <w:r>
-              <w:rPr>
-                <w:rFonts w:ascii="Times New Roman" w:hAnsi="Times New Roman"/>
-                <w:sz w:val="18"/>
-                <w:lang w:val="en-GB"/>
-              </w:rPr>
-              <w:t>0.827</w:t>
-            </w:r>
-          </w:p>
-        </w:tc>
-        <w:tc>
-          <w:tcPr>
-            <w:tcW w:w="1000" w:type="dxa"/>
-          </w:tcPr>
-          <w:p>
-            <w:pPr>
-              <w:pStyle w:val="PARAGRAPH"/>
-              <w:ind w:firstLine="0"/>
-              <w:rPr>
-                <w:rFonts w:ascii="Times New Roman" w:hAnsi="Times New Roman"/>
-                <w:sz w:val="18"/>
-                <w:lang w:val="en-GB"/>
-              </w:rPr>
-            </w:pPr>
-            <w:r>
-              <w:rPr>
-                <w:rFonts w:ascii="Times New Roman" w:hAnsi="Times New Roman"/>
-                <w:sz w:val="18"/>
-                <w:lang w:val="en-GB"/>
-              </w:rPr>
-              <w:t>0.664</w:t>
-            </w:r>
-          </w:p>
-        </w:tc>
-        <w:tc>
-          <w:tcPr>
-            <w:tcW w:w="1000" w:type="dxa"/>
-          </w:tcPr>
-          <w:p>
-            <w:pPr>
-              <w:pStyle w:val="PARAGRAPH"/>
-              <w:ind w:firstLine="0"/>
-              <w:rPr>
-                <w:rFonts w:ascii="Times New Roman" w:hAnsi="Times New Roman"/>
-                <w:sz w:val="18"/>
-                <w:lang w:val="en-GB"/>
-              </w:rPr>
-            </w:pPr>
-            <w:r>
-              <w:rPr>
-                <w:rFonts w:ascii="Times New Roman" w:hAnsi="Times New Roman"/>
-                <w:sz w:val="18"/>
-                <w:lang w:val="en-GB"/>
-              </w:rPr>
-              <w:t>0.889</w:t>
-            </w:r>
-          </w:p>
-        </w:tc>
-      </w:tr>
-      <w:tr>
-        <w:tblPrEx>
-          <w:tblCellMar>
-            <w:top w:w="0" w:type="dxa"/>
-            <w:bottom w:w="0" w:type="dxa"/>
-          </w:tblCellMar>
-        </w:tblPrEx>
-        <w:tc>
-          <w:tcPr>
-            <w:tcW w:w="1600" w:type="dxa"/>
-          </w:tcPr>
-          <w:p>
-            <w:pPr>
-              <w:pStyle w:val="PARAGRAPH"/>
-              <w:ind w:firstLine="0"/>
-              <w:rPr>
-                <w:rFonts w:ascii="Times New Roman" w:hAnsi="Times New Roman"/>
-                <w:sz w:val="18"/>
-                <w:lang w:val="en-GB"/>
-              </w:rPr>
-            </w:pPr>
-            <w:r>
-              <w:rPr>
-                <w:rFonts w:ascii="Times New Roman" w:hAnsi="Times New Roman"/>
-                <w:sz w:val="18"/>
-                <w:lang w:val="en-GB"/>
-              </w:rPr>
-              <w:t>gradient_boosting</w:t>
-            </w:r>
-          </w:p>
-        </w:tc>
-        <w:tc>
-          <w:tcPr>
-            <w:tcW w:w="1000" w:type="dxa"/>
-          </w:tcPr>
-          <w:p>
-            <w:pPr>
-              <w:pStyle w:val="PARAGRAPH"/>
-              <w:ind w:firstLine="0"/>
-              <w:rPr>
-                <w:rFonts w:ascii="Times New Roman" w:hAnsi="Times New Roman"/>
-                <w:sz w:val="18"/>
-                <w:lang w:val="en-GB"/>
-              </w:rPr>
-            </w:pPr>
-            <w:r>
-              <w:rPr>
-                <w:rFonts w:ascii="Times New Roman" w:hAnsi="Times New Roman"/>
-                <w:sz w:val="18"/>
-                <w:lang w:val="en-GB"/>
-              </w:rPr>
-              <w:t>0.839</w:t>
-            </w:r>
-          </w:p>
-        </w:tc>
-        <w:tc>
-          <w:tcPr>
-            <w:tcW w:w="1000" w:type="dxa"/>
-          </w:tcPr>
-          <w:p>
-            <w:pPr>
-              <w:pStyle w:val="PARAGRAPH"/>
-              <w:ind w:firstLine="0"/>
-              <w:rPr>
-                <w:rFonts w:ascii="Times New Roman" w:hAnsi="Times New Roman"/>
-                <w:sz w:val="18"/>
-                <w:lang w:val="en-GB"/>
-              </w:rPr>
-            </w:pPr>
-            <w:r>
-              <w:rPr>
-                <w:rFonts w:ascii="Times New Roman" w:hAnsi="Times New Roman"/>
-                <w:sz w:val="18"/>
-                <w:lang w:val="en-GB"/>
-              </w:rPr>
-              <w:t>0.626</w:t>
-            </w:r>
-          </w:p>
-        </w:tc>
-        <w:tc>
-          <w:tcPr>
-            <w:tcW w:w="1000" w:type="dxa"/>
-          </w:tcPr>
-          <w:p>
-            <w:pPr>
-              <w:pStyle w:val="PARAGRAPH"/>
-              <w:ind w:firstLine="0"/>
-              <w:rPr>
-                <w:rFonts w:ascii="Times New Roman" w:hAnsi="Times New Roman"/>
-                <w:sz w:val="18"/>
-                <w:lang w:val="en-GB"/>
-              </w:rPr>
-            </w:pPr>
-            <w:r>
-              <w:rPr>
-                <w:rFonts w:ascii="Times New Roman" w:hAnsi="Times New Roman"/>
-                <w:sz w:val="18"/>
-                <w:lang w:val="en-GB"/>
-              </w:rPr>
-              <w:t>0.891</w:t>
-            </w:r>
-          </w:p>
-        </w:tc>
-      </w:tr>
-    </w:tbl>
     <w:p>
       <w:pPr>
         <w:pStyle w:val="PARAGRAPH"/>
         <w:ind w:firstLine="317"/>
-        <w:jc w:val="left"/>
         <w:rPr>
           <w:rFonts w:ascii="Times New Roman" w:hAnsi="Times New Roman"/>
           <w:sz w:val="20"/>
           <w:lang w:val="en-GB"/>
         </w:rPr>
       </w:pPr>
-      <w:r/>
-    </w:p>
-    <w:p>
-      <w:pPr>
-        <w:pStyle w:val="PARAGRAPH"/>
-        <w:ind w:firstLine="317"/>
-        <w:rPr>
-          <w:rFonts w:ascii="Times New Roman" w:hAnsi="Times New Roman"/>
-          <w:sz w:val="20"/>
-          <w:lang w:val="en-GB"/>
-        </w:rPr>
-      </w:pPr>
-    </w:p>
-    <w:p>
-      <w:pPr>
-        <w:pStyle w:val="PARAGRAPH"/>
-        <w:ind w:firstLine="0"/>
-        <w:rPr>
-          <w:rFonts w:ascii="Times New Roman" w:hAnsi="Times New Roman"/>
-          <w:lang w:val="en-GB"/>
-        </w:rPr>
-      </w:pPr>
-    </w:p>
-    <w:p>
-      <w:pPr>
-        <w:pStyle w:val="1"/>
-        <w:spacing w:before="0" w:after="0" w:line="230" w:lineRule="exact"/>
-        <w:ind w:left="317" w:hanging="317"/>
+      <w:r>
         <w:rPr>
           <w:rFonts w:ascii="Times New Roman" w:hAnsi="Times New Roman"/>
           <w:color w:val="000000"/>
           <w:sz w:val="20"/>
           <w:lang w:val="en-GB"/>
         </w:rPr>
-      </w:pPr>
-      <w:bookmarkStart w:id="2" w:name="_Hlk505887282"/>
+      </w:r>
+    </w:p>
+    <w:p>
+      <w:pPr>
+        <w:pStyle w:val="PARAGRAPH"/>
+        <w:ind w:firstLine="0"/>
+        <w:rPr>
+          <w:rFonts w:ascii="Times New Roman" w:hAnsi="Times New Roman"/>
+          <w:lang w:val="en-GB"/>
+        </w:rPr>
+      </w:pPr>
+    </w:p>
+    <w:p>
+      <w:pPr>
+        <w:keepNext/>
+        <w:keepLines/>
+        <w:pageBreakBefore w:val="0"/>
+        <w:spacing w:line="240" w:lineRule="auto" w:before="80" w:after="60"/>
+        <w:ind w:left="0" w:right="0" w:firstLine="0"/>
+        <w:jc w:val="center"/>
+      </w:pPr>
       <w:r>
+        <w:drawing>
+          <wp:inline xmlns:a="http://schemas.openxmlformats.org/drawingml/2006/main" xmlns:pic="http://schemas.openxmlformats.org/drawingml/2006/picture">
+            <wp:extent cx="2148840" cy="1880235"/>
+            <wp:docPr id="1" name="Picture 1"/>
+            <wp:cNvGraphicFramePr>
+              <a:graphicFrameLocks noChangeAspect="1"/>
+            </wp:cNvGraphicFramePr>
+            <a:graphic>
+              <a:graphicData uri="http://schemas.openxmlformats.org/drawingml/2006/picture">
+                <pic:pic>
+                  <pic:nvPicPr>
+                    <pic:cNvPr id="0" name="confusion_matrix.png"/>
+                    <pic:cNvPicPr/>
+                  </pic:nvPicPr>
+                  <pic:blipFill>
+                    <a:blip r:embed="rId16"/>
+                    <a:stretch>
+                      <a:fillRect/>
+                    </a:stretch>
+                  </pic:blipFill>
+                  <pic:spPr>
+                    <a:xfrm>
+                      <a:off x="0" y="0"/>
+                      <a:ext cx="2148840" cy="1880235"/>
+                    </a:xfrm>
+                    <a:prstGeom prst="rect"/>
+                  </pic:spPr>
+                </pic:pic>
+              </a:graphicData>
+            </a:graphic>
+          </wp:inline>
+        </w:drawing>
+      </w:r>
+    </w:p>
+    <w:p>
+      <w:pPr>
+        <w:keepNext w:val="0"/>
+        <w:spacing w:line="240" w:lineRule="auto" w:after="120"/>
+        <w:jc w:val="center"/>
+      </w:pPr>
+      <w:r>
+        <w:rPr>
+          <w:rFonts w:ascii="Times New Roman" w:hAnsi="Times New Roman"/>
+          <w:sz w:val="18"/>
+        </w:rPr>
+        <w:t>Figure 1. Test-set confusion matrix.</w:t>
+      </w:r>
+    </w:p>
+    <w:p>
+      <w:pPr>
+        <w:pStyle w:val="1"/>
+        <w:spacing w:before="0" w:after="0" w:line="230" w:lineRule="exact"/>
+        <w:ind w:left="317" w:hanging="317"/>
         <w:rPr>
           <w:rFonts w:ascii="Times New Roman" w:hAnsi="Times New Roman"/>
           <w:color w:val="000000"/>
           <w:sz w:val="20"/>
           <w:lang w:val="en-GB"/>
         </w:rPr>
-      </w:r>
-    </w:p>
-    <w:p>
-      <w:pPr>
-        <w:pStyle w:val="1"/>
-        <w:spacing w:before="0" w:after="0" w:line="230" w:lineRule="exact"/>
-        <w:ind w:left="317" w:hanging="317"/>
+      </w:pPr>
+      <w:bookmarkStart w:id="3" w:name="_Hlk505887282"/>
+      <w:r>
         <w:rPr>
           <w:rFonts w:ascii="Times New Roman" w:hAnsi="Times New Roman"/>
           <w:color w:val="000000"/>
           <w:sz w:val="20"/>
           <w:lang w:val="en-GB"/>
         </w:rPr>
-      </w:pPr>
+        <w:t>DIS</w:t>
+      </w:r>
       <w:r>
         <w:rPr>
           <w:rFonts w:ascii="Times New Roman" w:hAnsi="Times New Roman"/>
@@ -907,18 +404,9 @@
           <w:sz w:val="20"/>
           <w:lang w:val="en-GB"/>
         </w:rPr>
-        <w:t>DIS</w:t>
-      </w:r>
-      <w:r>
-        <w:rPr>
-          <w:rFonts w:ascii="Times New Roman" w:hAnsi="Times New Roman"/>
-          <w:color w:val="000000"/>
-          <w:sz w:val="20"/>
-          <w:lang w:val="en-GB"/>
-        </w:rPr>
         <w:t>CUSSION</w:t>
       </w:r>
-      <w:bookmarkEnd w:id="2"/>
+      <w:bookmarkEnd w:id="3"/>
     </w:p>
     <w:p>
       <w:pPr>
@@ -1090,13 +578,6 @@
           <w:sz w:val="20"/>
         </w:rPr>
         <w:t>[1]</w:t>
-      </w:r>
-      <w:r>
-        <w:rPr>
-          <w:color w:val="000000"/>
-          <w:spacing w:val="-8"/>
-          <w:sz w:val="20"/>
-        </w:rPr>
         <w:tab/>
         <w:t>Pedregosa, F. et al. (2011). Scikit-learn: Machine Learning in Python. Journal of Machine Learning Research, 12, 2825-2830.</w:t>
       </w:r>
@@ -1120,14 +601,6 @@
           <w:lang w:val="en-US"/>
         </w:rPr>
         <w:t>[2]</w:t>
-      </w:r>
-      <w:r>
-        <w:rPr>
-          <w:color w:val="000000"/>
-          <w:spacing w:val="-8"/>
-          <w:sz w:val="20"/>
-          <w:lang w:val="en-US"/>
-        </w:rPr>
         <w:tab/>
         <w:t>Breiman, L. (2001). Random Forests. Machine Learning, 45(1), 5-32.</w:t>
       </w:r>
@@ -1135,17 +608,12 @@
     <w:p>
       <w:pPr>
         <w:pStyle w:val="VITA"/>
+        <w:jc w:val="left"/>
+      </w:pPr>
+      <w:r>
         <w:rPr>
           <w:rFonts w:ascii="Times New Roman" w:hAnsi="Times New Roman"/>
           <w:sz w:val="20"/>
-          <w:lang w:val="en-GB"/>
-        </w:rPr>
-      </w:pPr>
-      <w:r>
-        <w:rPr>
-          <w:rFonts w:ascii="Times New Roman" w:hAnsi="Times New Roman"/>
-          <w:sz w:val="20"/>
-          <w:lang w:val="en-GB"/>
         </w:rPr>
         <w:t>Name: LIN TONG</w:t>
       </w:r>
@@ -1153,17 +621,12 @@
     <w:p>
       <w:pPr>
         <w:pStyle w:val="VITA"/>
+        <w:jc w:val="left"/>
+      </w:pPr>
+      <w:r>
         <w:rPr>
           <w:rFonts w:ascii="Times New Roman" w:hAnsi="Times New Roman"/>
           <w:sz w:val="20"/>
-          <w:lang w:val="en-GB"/>
-        </w:rPr>
-      </w:pPr>
-      <w:r>
-        <w:rPr>
-          <w:rFonts w:ascii="Times New Roman" w:hAnsi="Times New Roman"/>
-          <w:sz w:val="20"/>
-          <w:lang w:val="en-GB"/>
         </w:rPr>
         <w:t>Matric number: G2608825L</w:t>
       </w:r>
@@ -1171,17 +634,12 @@
     <w:p>
       <w:pPr>
         <w:pStyle w:val="VITA"/>
+        <w:jc w:val="left"/>
+      </w:pPr>
+      <w:r>
         <w:rPr>
           <w:rFonts w:ascii="Times New Roman" w:hAnsi="Times New Roman"/>
           <w:sz w:val="20"/>
-          <w:lang w:val="en-GB"/>
-        </w:rPr>
-      </w:pPr>
-      <w:r>
-        <w:rPr>
-          <w:rFonts w:ascii="Times New Roman" w:hAnsi="Times New Roman"/>
-          <w:sz w:val="20"/>
-          <w:lang w:val="en-GB"/>
         </w:rPr>
         <w:t>Assignment: IN6227-2023-Assignment-1, Variant 2</w:t>
       </w:r>
@@ -1189,17 +647,12 @@
     <w:p>
       <w:pPr>
         <w:pStyle w:val="VITA"/>
+        <w:jc w:val="left"/>
+      </w:pPr>
+      <w:r>
         <w:rPr>
           <w:rFonts w:ascii="Times New Roman" w:hAnsi="Times New Roman"/>
           <w:sz w:val="20"/>
-          <w:lang w:val="en-GB"/>
-        </w:rPr>
-      </w:pPr>
-      <w:r>
-        <w:rPr>
-          <w:rFonts w:ascii="Times New Roman" w:hAnsi="Times New Roman"/>
-          <w:sz w:val="20"/>
-          <w:lang w:val="en-GB"/>
         </w:rPr>
         <w:t>Model (LLM): GLM-5.2</w:t>
       </w:r>
@@ -1207,17 +660,12 @@
     <w:p>
       <w:pPr>
         <w:pStyle w:val="VITA"/>
+        <w:jc w:val="left"/>
+      </w:pPr>
+      <w:r>
         <w:rPr>
           <w:rFonts w:ascii="Times New Roman" w:hAnsi="Times New Roman"/>
           <w:sz w:val="20"/>
-          <w:lang w:val="en-GB"/>
-        </w:rPr>
-      </w:pPr>
-      <w:r>
-        <w:rPr>
-          <w:rFonts w:ascii="Times New Roman" w:hAnsi="Times New Roman"/>
-          <w:sz w:val="20"/>
-          <w:lang w:val="en-GB"/>
         </w:rPr>
         <w:t>LLM interface: TraeCode (Codex)</w:t>
       </w:r>
@@ -1225,11 +673,7 @@
     <w:p>
       <w:pPr>
         <w:pStyle w:val="VITA"/>
-        <w:rPr>
-          <w:rFonts w:ascii="Times New Roman" w:hAnsi="Times New Roman"/>
-          <w:sz w:val="20"/>
-          <w:lang w:val="en-GB"/>
-        </w:rPr>
+        <w:jc w:val="left"/>
         <w:sectPr>
           <w:type w:val="continuous"/>
           <w:pgSz w:w="11906" w:h="16838" w:code="9"/>
@@ -1241,6 +685,10 @@
         </w:sectPr>
       </w:pPr>
       <w:r>
+        <w:rPr>
+          <w:rFonts w:ascii="Times New Roman" w:hAnsi="Times New Roman"/>
+          <w:sz w:val="20"/>
+        </w:rPr>
         <w:t>GitHub: https://github.com/tonglynn/in6227-tabular-classification-skill</w:t>
       </w:r>
     </w:p>
@@ -1282,24 +730,100 @@
 
 <file path=word/footer1.xml><?xml version="1.0" encoding="utf-8"?>
 <w:ftr xmlns:wpc="http://schemas.microsoft.com/office/word/2010/wordprocessingCanvas" xmlns:cx="http://schemas.microsoft.com/office/drawing/2014/chartex" xmlns:cx1="http://schemas.microsoft.com/office/drawing/2015/9/8/chartex" xmlns:cx2="http://schemas.microsoft.com/office/drawing/2015/10/21/chartex" xmlns:cx3="http://schemas.microsoft.com/office/drawing/2016/5/9/chartex" xmlns:cx4="http://schemas.microsoft.com/office/drawing/2016/5/10/chartex" xmlns:cx5="http://schemas.microsoft.com/office/drawing/2016/5/11/chartex" xmlns:cx6="http://schemas.microsoft.com/office/drawing/2016/5/12/chartex" xmlns:cx7="http://schemas.microsoft.com/office/drawing/2016/5/13/chartex" xmlns:cx8="http://schemas.microsoft.com/office/drawing/2016/5/14/chartex" xmlns:mc="http://schemas.openxmlformats.org/markup-compatibility/2006" xmlns:aink="http://schemas.microsoft.com/office/drawing/2016/ink" xmlns:am3d="http://schemas.microsoft.com/office/drawing/2017/model3d" xmlns:o="urn:schemas-microsoft-com:office:office" xmlns:oel="http://schemas.microsoft.com/office/2019/extlst" xmlns:r="http://schemas.openxmlformats.org/officeDocument/2006/relationships" xmlns:m="http://schemas.openxmlformats.org/officeDocument/2006/math" xmlns:v="urn:schemas-microsoft-com:vml" xmlns:wp14="http://schemas.microsoft.com/office/word/2010/wordprocessingDrawing" xmlns:wp="http://schemas.openxmlformats.org/drawingml/2006/wordprocessingDrawing" xmlns:w10="urn:schemas-microsoft-com:office:word" xmlns:w="http://schemas.openxmlformats.org/wordprocessingml/2006/main" xmlns:w14="http://schemas.microsoft.com/office/word/2010/wordml" xmlns:w15="http://schemas.microsoft.com/office/word/2012/wordml" xmlns:w16cex="http://schemas.microsoft.com/office/word/2018/wordml/cex" xmlns:w16cid="http://schemas.microsoft.com/office/word/2016/wordml/cid" xmlns:w16="http://schemas.microsoft.com/office/word/2018/wordml" xmlns:w16du="http://schemas.microsoft.com/office/word/2023/wordml/word16du" xmlns:w16sdtdh="http://schemas.microsoft.com/office/word/2020/wordml/sdtdatahash" xmlns:w16sdtfl="http://schemas.microsoft.com/office/word/2024/wordml/sdtformatlock" xmlns:w16se="http://schemas.microsoft.com/office/word/2015/wordml/symex" xmlns:wpg="http://schemas.microsoft.com/office/word/2010/wordprocessingGroup" xmlns:wpi="http://schemas.microsoft.com/office/word/2010/wordprocessingInk" xmlns:wne="http://schemas.microsoft.com/office/word/2006/wordml" xmlns:wps="http://schemas.microsoft.com/office/word/2010/wordprocessingShape" mc:Ignorable="w14 w15 w16se w16cid w16 w16cex w16sdtdh w16sdtfl w16du wp14">
+  <w:tbl>
+    <w:tblPr>
+      <w:tblW w:w="5000" w:type="pct"/>
+      <w:tblCellMar>
+        <w:left w:w="0" w:type="dxa"/>
+        <w:right w:w="0" w:type="dxa"/>
+      </w:tblCellMar>
+      <w:tblLook w:val="04A0" w:firstRow="1" w:lastRow="0" w:firstColumn="1" w:lastColumn="0" w:noHBand="0" w:noVBand="1"/>
+    </w:tblPr>
+    <w:tblGrid>
+      <w:gridCol w:w="4680"/>
+      <w:gridCol w:w="390"/>
+      <w:gridCol w:w="4676"/>
+    </w:tblGrid>
+    <w:tr>
+      <w:tc>
+        <w:tcPr>
+          <w:tcW w:w="2401" w:type="pct"/>
+        </w:tcPr>
+        <w:p>
+          <w:pPr>
+            <w:pStyle w:val="a8"/>
+            <w:rPr>
+              <w:caps/>
+              <w:color w:val="4472C4"/>
+              <w:sz w:val="18"/>
+              <w:szCs w:val="18"/>
+            </w:rPr>
+          </w:pPr>
+          <w:r>
+            <w:rPr>
+              <w:caps/>
+              <w:color w:val="4472C4"/>
+              <w:sz w:val="18"/>
+              <w:szCs w:val="18"/>
+            </w:rPr>
+            <w:t>Tabular Classification</w:t>
+          </w:r>
+        </w:p>
+      </w:tc>
+      <w:tc>
+        <w:tcPr>
+          <w:tcW w:w="200" w:type="pct"/>
+        </w:tcPr>
+        <w:p>
+          <w:pPr>
+            <w:pStyle w:val="a8"/>
+            <w:rPr>
+              <w:caps/>
+              <w:color w:val="4472C4"/>
+              <w:sz w:val="18"/>
+              <w:szCs w:val="18"/>
+            </w:rPr>
+          </w:pPr>
+        </w:p>
+      </w:tc>
+      <w:tc>
+        <w:tcPr>
+          <w:tcW w:w="2402" w:type="pct"/>
+        </w:tcPr>
+        <w:p>
+          <w:pPr>
+            <w:pStyle w:val="a8"/>
+            <w:jc w:val="right"/>
+            <w:rPr>
+              <w:caps/>
+              <w:color w:val="4472C4"/>
+              <w:sz w:val="18"/>
+              <w:szCs w:val="18"/>
+            </w:rPr>
+          </w:pPr>
+          <w:r>
+            <w:rPr>
+              <w:caps/>
+              <w:color w:val="4472C4"/>
+              <w:sz w:val="18"/>
+              <w:szCs w:val="18"/>
+            </w:rPr>
+            <w:t>LIN TONG</w:t>
+          </w:r>
+        </w:p>
+      </w:tc>
+    </w:tr>
+  </w:tbl>
   <w:p>
     <w:pPr>
       <w:pStyle w:val="a8"/>
-      <w:tabs>
-        <w:tab w:pos="9000" w:val="right"/>
-      </w:tabs>
+      <w:rPr>
+        <w:rFonts w:ascii="Calibri" w:hAnsi="Calibri" w:cs="Calibri"/>
+        <w:color w:val="A6A6A6"/>
+        <w:sz w:val="18"/>
+        <w:szCs w:val="18"/>
+      </w:rPr>
     </w:pPr>
-    <w:r/>
-    <w:r>
-      <w:rPr>
-        <w:rFonts w:ascii="Times New Roman" w:hAnsi="Times New Roman"/>
-        <w:color w:val="4472C4"/>
-        <w:sz w:val="18"/>
-      </w:rPr>
-      <w:t>IN6227 ASSIGNMENT 1, VARIANT 2</w:t>
-      <w:tab/>
-      <w:t>LIN TONG, G2608825L</w:t>
-    </w:r>
   </w:p>
 </w:ftr>
 </file>
@@ -1309,55 +833,45 @@
   <w:p>
     <w:pPr>
       <w:pStyle w:val="a8"/>
-      <w:tabs>
-        <w:tab w:pos="9000" w:val="right"/>
-      </w:tabs>
-      <w:rPr>
-        <w:caps/>
-        <w:color w:val="4472C4"/>
-        <w:sz w:val="18"/>
-        <w:szCs w:val="18"/>
+      <w:rPr>
+        <w:rFonts w:ascii="Calibri" w:hAnsi="Calibri" w:cs="Calibri"/>
+        <w:color w:val="A6A6A6"/>
       </w:rPr>
     </w:pPr>
-    <w:r/>
     <w:r>
       <w:rPr>
-        <w:rFonts w:ascii="Times New Roman" w:hAnsi="Times New Roman"/>
-        <w:color w:val="4472C4"/>
-        <w:sz w:val="18"/>
-      </w:rPr>
-      <w:t>IN6227 ASSIGNMENT 1, VARIANT 2</w:t>
-      <w:tab/>
-      <w:t>LIN TONG, G2608825L</w:t>
+        <w:rFonts w:ascii="Calibri" w:hAnsi="Calibri" w:cs="Calibri"/>
+        <w:color w:val="A6A6A6"/>
+      </w:rPr>
+      <w:t>Wee Kim Wee School of Communication and Information</w:t>
+    </w:r>
+  </w:p>
+  <w:p>
+    <w:pPr>
+      <w:pStyle w:val="a8"/>
+      <w:rPr>
+        <w:rFonts w:ascii="Calibri" w:hAnsi="Calibri" w:cs="Calibri"/>
+        <w:color w:val="A6A6A6"/>
+        <w:lang w:val="en-SG"/>
+      </w:rPr>
+    </w:pPr>
+    <w:r>
+      <w:rPr>
+        <w:rFonts w:ascii="Calibri" w:hAnsi="Calibri" w:cs="Calibri"/>
+        <w:color w:val="A6A6A6"/>
+      </w:rPr>
+      <w:t xml:space="preserve"> (WKWSCI)</w:t>
     </w:r>
   </w:p>
 </w:ftr>
 </file>
 
 <file path=word/footer3.xml><?xml version="1.0" encoding="utf-8"?>
-<w:ftr xmlns:wpc="http://schemas.microsoft.com/office/word/2010/wordprocessingCanvas" xmlns:cx="http://schemas.microsoft.com/office/drawing/2014/chartex" xmlns:cx1="http://schemas.microsoft.com/office/drawing/2015/9/8/chartex" xmlns:cx2="http://schemas.microsoft.com/office/drawing/2015/10/21/chartex" xmlns:cx3="http://schemas.microsoft.com/office/drawing/2016/5/9/chartex" xmlns:cx4="http://schemas.microsoft.com/office/drawing/2016/5/10/chartex" xmlns:cx5="http://schemas.microsoft.com/office/drawing/2016/5/11/chartex" xmlns:cx6="http://schemas.microsoft.com/office/drawing/2016/5/12/chartex" xmlns:cx7="http://schemas.microsoft.com/office/drawing/2016/5/13/chartex" xmlns:cx8="http://schemas.microsoft.com/office/drawing/2016/5/14/chartex" xmlns:mc="http://schemas.openxmlformats.org/markup-compatibility/2006" xmlns:aink="http://schemas.microsoft.com/office/drawing/2016/ink" xmlns:am3d="http://schemas.microsoft.com/office/drawing/2017/model3d" xmlns:o="urn:schemas-microsoft-com:office:office" xmlns:oel="http://schemas.microsoft.com/office/2019/extlst" xmlns:r="http://schemas.openxmlformats.org/officeDocument/2006/relationships" xmlns:m="http://schemas.openxmlformats.org/officeDocument/2006/math" xmlns:v="urn:schemas-microsoft-com:vml" xmlns:wp14="http://schemas.microsoft.com/office/word/2010/wordprocessingDrawing" xmlns:wp="http://schemas.openxmlformats.org/drawingml/2006/wordprocessingDrawing" xmlns:w10="urn:schemas-microsoft-com:office:word" xmlns:w="http://schemas.openxmlformats.org/wordprocessingml/2006/main" xmlns:w14="http://schemas.microsoft.com/office/word/2010/wordml" xmlns:w15="http://schemas.microsoft.com/office/word/2012/wordml" xmlns:w16cex="http://schemas.microsoft.com/office/word/2018/wordml/cex" xmlns:w16cid="http://schemas.microsoft.com/office/word/2016/wordml/cid" xmlns:w16="http://schemas.microsoft.com/office/word/2018/wordml" xmlns:w16du="http://schemas.microsoft.com/office/word/2023/wordml/word16du" xmlns:w16sdtdh="http://schemas.microsoft.com/office/word/2020/wordml/sdtdatahash" xmlns:w16sdtfl="http://schemas.microsoft.com/office/word/2024/wordml/sdtformatlock" xmlns:w16se="http://schemas.microsoft.com/office/word/2015/wordml/symex" xmlns:wpg="http://schemas.microsoft.com/office/word/2010/wordprocessingGroup" xmlns:wpi="http://schemas.microsoft.com/office/word/2010/wordprocessingInk" xmlns:wne="http://schemas.microsoft.com/office/word/2006/wordml" xmlns:wps="http://schemas.microsoft.com/office/word/2010/wordprocessingShape" mc:Ignorable="w14 w15 w16se w16cid w16 w16cex w16sdtdh w16sdtfl w16du wp14">
+<w:ftr xmlns:m="http://schemas.openxmlformats.org/officeDocument/2006/math" xmlns:mc="http://schemas.openxmlformats.org/markup-compatibility/2006" xmlns:mo="http://schemas.microsoft.com/office/mac/office/2008/main" xmlns:mv="urn:schemas-microsoft-com:mac:vml" xmlns:o="urn:schemas-microsoft-com:office:office" xmlns:r="http://schemas.openxmlformats.org/officeDocument/2006/relationships" xmlns:v="urn:schemas-microsoft-com:vml" xmlns:w10="urn:schemas-microsoft-com:office:word" xmlns:w14="http://schemas.microsoft.com/office/word/2010/wordml" xmlns:w="http://schemas.openxmlformats.org/wordprocessingml/2006/main" xmlns:wne="http://schemas.microsoft.com/office/word/2006/wordml" xmlns:wp14="http://schemas.microsoft.com/office/word/2010/wordprocessingDrawing" xmlns:wp="http://schemas.openxmlformats.org/drawingml/2006/wordprocessingDrawing" xmlns:wpc="http://schemas.microsoft.com/office/word/2010/wordprocessingCanvas" xmlns:wpg="http://schemas.microsoft.com/office/word/2010/wordprocessingGroup" xmlns:wpi="http://schemas.microsoft.com/office/word/2010/wordprocessingInk" xmlns:wps="http://schemas.microsoft.com/office/word/2010/wordprocessingShape" mc:Ignorable="w14 wp14">
   <w:p>
     <w:pPr>
-      <w:pStyle w:val="a8"/>
-      <w:tabs>
-        <w:tab w:pos="9000" w:val="right"/>
-      </w:tabs>
-      <w:rPr>
-        <w:rFonts w:ascii="Calibri" w:hAnsi="Calibri" w:cs="Calibri"/>
-        <w:color w:val="A6A6A6"/>
-      </w:rPr>
+      <w:pStyle w:val="Footer"/>
     </w:pPr>
-    <w:r/>
-    <w:r>
-      <w:rPr>
-        <w:rFonts w:ascii="Times New Roman" w:hAnsi="Times New Roman"/>
-        <w:color w:val="4472C4"/>
-        <w:sz w:val="18"/>
-      </w:rPr>
-      <w:t>IN6227 ASSIGNMENT 1, VARIANT 2</w:t>
-      <w:tab/>
-      <w:t>LIN TONG, G2608825L</w:t>
-    </w:r>
   </w:p>
 </w:ftr>
 </file>
@@ -4663,10 +4177,10 @@
       </w:rPr>
     </w:lvl>
   </w:abstractNum>
-  <w:num w:numId="1" w16cid:durableId="1262563175">
+  <w:num w:numId="1" w16cid:durableId="426468062">
     <w:abstractNumId w:val="28"/>
   </w:num>
-  <w:num w:numId="2" w16cid:durableId="1322125869">
+  <w:num w:numId="2" w16cid:durableId="1013647317">
     <w:abstractNumId w:val="1"/>
     <w:lvlOverride w:ilvl="0">
       <w:lvl w:ilvl="0">
@@ -4684,13 +4198,13 @@
       </w:lvl>
     </w:lvlOverride>
   </w:num>
-  <w:num w:numId="3" w16cid:durableId="112331496">
+  <w:num w:numId="3" w16cid:durableId="879394107">
     <w:abstractNumId w:val="39"/>
   </w:num>
-  <w:num w:numId="4" w16cid:durableId="315767828">
+  <w:num w:numId="4" w16cid:durableId="339041820">
     <w:abstractNumId w:val="5"/>
   </w:num>
-  <w:num w:numId="5" w16cid:durableId="260181792">
+  <w:num w:numId="5" w16cid:durableId="872349758">
     <w:abstractNumId w:val="1"/>
     <w:lvlOverride w:ilvl="0">
       <w:lvl w:ilvl="0">
@@ -4708,34 +4222,34 @@
       </w:lvl>
     </w:lvlOverride>
   </w:num>
-  <w:num w:numId="6" w16cid:durableId="1893231834">
+  <w:num w:numId="6" w16cid:durableId="1706633430">
     <w:abstractNumId w:val="16"/>
   </w:num>
-  <w:num w:numId="7" w16cid:durableId="893738184">
+  <w:num w:numId="7" w16cid:durableId="1400058999">
     <w:abstractNumId w:val="23"/>
   </w:num>
-  <w:num w:numId="8" w16cid:durableId="662901264">
+  <w:num w:numId="8" w16cid:durableId="1844124146">
     <w:abstractNumId w:val="36"/>
   </w:num>
-  <w:num w:numId="9" w16cid:durableId="302584005">
+  <w:num w:numId="9" w16cid:durableId="240455036">
     <w:abstractNumId w:val="11"/>
   </w:num>
-  <w:num w:numId="10" w16cid:durableId="372846355">
+  <w:num w:numId="10" w16cid:durableId="1907841033">
     <w:abstractNumId w:val="18"/>
   </w:num>
-  <w:num w:numId="11" w16cid:durableId="645476567">
+  <w:num w:numId="11" w16cid:durableId="493641945">
     <w:abstractNumId w:val="10"/>
   </w:num>
-  <w:num w:numId="12" w16cid:durableId="1435248551">
+  <w:num w:numId="12" w16cid:durableId="796988358">
     <w:abstractNumId w:val="9"/>
   </w:num>
-  <w:num w:numId="13" w16cid:durableId="1807627802">
+  <w:num w:numId="13" w16cid:durableId="1411999098">
     <w:abstractNumId w:val="0"/>
   </w:num>
-  <w:num w:numId="14" w16cid:durableId="1069810713">
+  <w:num w:numId="14" w16cid:durableId="1452507067">
     <w:abstractNumId w:val="17"/>
   </w:num>
-  <w:num w:numId="15" w16cid:durableId="1512332862">
+  <w:num w:numId="15" w16cid:durableId="1968775493">
     <w:abstractNumId w:val="17"/>
     <w:lvlOverride w:ilvl="0">
       <w:lvl w:ilvl="0">
@@ -4750,10 +4264,10 @@
       </w:lvl>
     </w:lvlOverride>
   </w:num>
-  <w:num w:numId="16" w16cid:durableId="1107039120">
+  <w:num w:numId="16" w16cid:durableId="425157511">
     <w:abstractNumId w:val="24"/>
   </w:num>
-  <w:num w:numId="17" w16cid:durableId="629941886">
+  <w:num w:numId="17" w16cid:durableId="76218933">
     <w:abstractNumId w:val="24"/>
     <w:lvlOverride w:ilvl="0">
       <w:lvl w:ilvl="0">
@@ -4768,85 +4282,85 @@
       </w:lvl>
     </w:lvlOverride>
   </w:num>
-  <w:num w:numId="18" w16cid:durableId="2058506207">
+  <w:num w:numId="18" w16cid:durableId="1488353462">
     <w:abstractNumId w:val="19"/>
   </w:num>
-  <w:num w:numId="19" w16cid:durableId="1506672986">
+  <w:num w:numId="19" w16cid:durableId="1046106040">
     <w:abstractNumId w:val="12"/>
   </w:num>
-  <w:num w:numId="20" w16cid:durableId="164904505">
+  <w:num w:numId="20" w16cid:durableId="209465909">
     <w:abstractNumId w:val="30"/>
   </w:num>
-  <w:num w:numId="21" w16cid:durableId="1077944414">
+  <w:num w:numId="21" w16cid:durableId="1645624768">
     <w:abstractNumId w:val="25"/>
   </w:num>
-  <w:num w:numId="22" w16cid:durableId="1543403338">
+  <w:num w:numId="22" w16cid:durableId="1001664637">
     <w:abstractNumId w:val="37"/>
   </w:num>
-  <w:num w:numId="23" w16cid:durableId="449055639">
+  <w:num w:numId="23" w16cid:durableId="1903447382">
     <w:abstractNumId w:val="14"/>
   </w:num>
-  <w:num w:numId="24" w16cid:durableId="1052773726">
+  <w:num w:numId="24" w16cid:durableId="602030672">
     <w:abstractNumId w:val="13"/>
   </w:num>
-  <w:num w:numId="25" w16cid:durableId="35391636">
+  <w:num w:numId="25" w16cid:durableId="985547554">
     <w:abstractNumId w:val="35"/>
   </w:num>
-  <w:num w:numId="26" w16cid:durableId="1211259337">
+  <w:num w:numId="26" w16cid:durableId="1125736801">
     <w:abstractNumId w:val="20"/>
   </w:num>
-  <w:num w:numId="27" w16cid:durableId="986593280">
+  <w:num w:numId="27" w16cid:durableId="351037636">
     <w:abstractNumId w:val="32"/>
   </w:num>
-  <w:num w:numId="28" w16cid:durableId="673730297">
+  <w:num w:numId="28" w16cid:durableId="1869634582">
     <w:abstractNumId w:val="4"/>
   </w:num>
-  <w:num w:numId="29" w16cid:durableId="2009168638">
+  <w:num w:numId="29" w16cid:durableId="1936816377">
     <w:abstractNumId w:val="2"/>
   </w:num>
-  <w:num w:numId="30" w16cid:durableId="1022783087">
+  <w:num w:numId="30" w16cid:durableId="968702043">
     <w:abstractNumId w:val="6"/>
   </w:num>
-  <w:num w:numId="31" w16cid:durableId="1848446755">
+  <w:num w:numId="31" w16cid:durableId="1108620961">
     <w:abstractNumId w:val="21"/>
   </w:num>
-  <w:num w:numId="32" w16cid:durableId="1586062723">
+  <w:num w:numId="32" w16cid:durableId="2075395070">
     <w:abstractNumId w:val="38"/>
   </w:num>
-  <w:num w:numId="33" w16cid:durableId="508763098">
+  <w:num w:numId="33" w16cid:durableId="1452896745">
     <w:abstractNumId w:val="27"/>
   </w:num>
-  <w:num w:numId="34" w16cid:durableId="912735919">
+  <w:num w:numId="34" w16cid:durableId="1439831927">
     <w:abstractNumId w:val="22"/>
   </w:num>
-  <w:num w:numId="35" w16cid:durableId="251469973">
+  <w:num w:numId="35" w16cid:durableId="1442724747">
     <w:abstractNumId w:val="31"/>
   </w:num>
-  <w:num w:numId="36" w16cid:durableId="989989114">
+  <w:num w:numId="36" w16cid:durableId="2026517973">
     <w:abstractNumId w:val="33"/>
   </w:num>
-  <w:num w:numId="37" w16cid:durableId="17436825">
+  <w:num w:numId="37" w16cid:durableId="1995639518">
     <w:abstractNumId w:val="7"/>
   </w:num>
-  <w:num w:numId="38" w16cid:durableId="1834831927">
+  <w:num w:numId="38" w16cid:durableId="254361769">
     <w:abstractNumId w:val="8"/>
   </w:num>
-  <w:num w:numId="39" w16cid:durableId="132060686">
+  <w:num w:numId="39" w16cid:durableId="1561671311">
     <w:abstractNumId w:val="15"/>
   </w:num>
-  <w:num w:numId="40" w16cid:durableId="1423645426">
+  <w:num w:numId="40" w16cid:durableId="1095515149">
     <w:abstractNumId w:val="34"/>
   </w:num>
-  <w:num w:numId="41" w16cid:durableId="2041583864">
+  <w:num w:numId="41" w16cid:durableId="166332619">
     <w:abstractNumId w:val="29"/>
   </w:num>
-  <w:num w:numId="42" w16cid:durableId="607158201">
+  <w:num w:numId="42" w16cid:durableId="116024281">
     <w:abstractNumId w:val="3"/>
   </w:num>
-  <w:num w:numId="43" w16cid:durableId="744188826">
+  <w:num w:numId="43" w16cid:durableId="948439393">
     <w:abstractNumId w:val="40"/>
   </w:num>
-  <w:num w:numId="44" w16cid:durableId="995496500">
+  <w:num w:numId="44" w16cid:durableId="1932547818">
     <w:abstractNumId w:val="26"/>
   </w:num>
 </w:numbering>

</xml_diff>

<commit_message>
Expand report narrative and analysis
</commit_message>
<xml_diff>
--- a/final_report.docx
+++ b/final_report.docx
@@ -132,11 +132,9 @@
       <w:r>
         <w:rPr>
           <w:rFonts w:ascii="Times New Roman" w:hAnsi="Times New Roman"/>
-          <w:color w:val="000000"/>
           <w:sz w:val="20"/>
-          <w:lang w:val="en-GB"/>
-        </w:rPr>
-        <w:t>This report presents an end-to-end tabular classification workflow applied to the dataset (31112 rows, 15 features). The target variable is label with 2 classes: no, yes. Class distribution (train): no=23645, yes=7464, imbalance ratio 3.168:1. The data contains 50 missing values. Column types: 7 numeric, 8 categorical. The goal is to build a leakage-safe, reproducible classification pipeline and compare multiple models.</w:t>
+        </w:rPr>
+        <w:t>This report presents an end-to-end tabular classification workflow applied to the dataset (31,112 rows, 15 features). The target variable is label with two classes: no and yes. The training distribution is no=23,645 and yes=7,464, giving a 3.168:1 imbalance. The data contains 50 missing feature values and three missing target labels; rows with missing labels were removed before training. There are seven numeric and eight categorical predictors, with no duplicate rows. The objective is to build a leakage-safe, reproducible pipeline and compare transparent linear and nonlinear classifiers under the same evaluation protocol.</w:t>
       </w:r>
     </w:p>
     <w:p>
@@ -214,11 +212,9 @@
       <w:r>
         <w:rPr>
           <w:rFonts w:ascii="Times New Roman" w:hAnsi="Times New Roman"/>
-          <w:color w:val="000000"/>
           <w:sz w:val="20"/>
-          <w:lang w:val="en-GB"/>
-        </w:rPr>
-        <w:t>All learned preprocessing (median imputation for numerics, most-frequent imputation and one-hot encoding for categorics, standard scaling) is embedded inside sklearn Pipeline / ColumnTransformer, so during cross-validation the imputer, scaler, and encoder are refit on each training fold only. No manual feature selection is applied. Four classifiers are trained: DummyClassifier (stratified baseline), LogisticRegression (max_iter=1000, class_weight=balanced), RandomForest (n_estimators=200, class_weight=balanced), and GradientBoosting (n_estimators=100, max_depth=3). Cross-validation uses Stratified 5-fold (random_state=42). Model selection uses mean CV F1. The best model is retrained on the full training set and evaluated once on the held-out test set.</w:t>
+        </w:rPr>
+        <w:t>All learned preprocessing is embedded inside an sklearn Pipeline and ColumnTransformer, so imputation, scaling, and encoding are refit within each training fold. Numeric columns use median imputation followed by standard scaling; categorical columns use most-frequent imputation followed by one-hot encoding with handle_unknown="ignore". All 15 original features are retained. No feature is selected using the test set, and no additional feature engineering is imposed because the data already includes the derived composite_rank field. Four classifiers are trained: DummyClassifier with a stratified strategy as the no-information baseline, LogisticRegression for an interpretable linear benchmark, RandomForest for nonlinear interactions, and GradientBoosting as a strong tabular baseline. Stratified five-fold cross-validation with shuffle=True and random_state=42 preserves the class ratio. Mean CV F1 is the primary selection metric; ROC-AUC and PR-AUC provide additional ranking evidence. The selected model is retrained on all training rows and evaluated once on the held-out test set. Balanced class weights are used for LogisticRegression and RandomForest because the minority class is about one quarter of the data.</w:t>
       </w:r>
     </w:p>
     <w:p>
@@ -273,19 +269,12 @@
           <w:lang w:val="en-GB"/>
         </w:rPr>
       </w:pPr>
-      <w:bookmarkStart w:id="2" w:name="_Hlk506313215"/>
-      <w:bookmarkEnd w:id="2"/>
       <w:r>
         <w:rPr>
           <w:rFonts w:ascii="Times New Roman" w:hAnsi="Times New Roman"/>
-          <w:color w:val="000000"/>
           <w:sz w:val="20"/>
-          <w:lang w:val="en-GB"/>
-        </w:rPr>
-        <w:t>Test-set performance (best model: random_forest): accuracy=0.8272, precision=0.6177, recall=0.7156, F1=0.6631, ROC-AUC=0.8887, PR-AUC=0.7010.</w:t>
-      </w:r>
-      <w:r>
-        <w:t xml:space="preserve"> CV comparison: dummy F1=0.235, logistic regression F1=0.660, random forest F1=0.664, gradient boosting F1=0.626.</w:t>
+        </w:rPr>
+        <w:t>Test-set performance for the selected RandomForest is accuracy=0.8272, precision=0.6177, recall=0.7156, F1=0.6631, ROC-AUC=0.8887, and PR-AUC=0.7010. The CV comparison is: DummyClassifier accuracy=0.635 and F1=0.235; LogisticRegression accuracy=0.790 and F1=0.660; RandomForest accuracy=0.827 and F1=0.664; GradientBoosting accuracy=0.839 and F1=0.626. The test confusion matrix contains 8,762 true negatives, 1,403 false positives, 901 false negatives, and 2,267 true positives. The figure shows that the model identifies most minority-class cases while retaining a moderate false-positive count.</w:t>
       </w:r>
     </w:p>
     <w:p>
@@ -432,12 +421,9 @@
       <w:r>
         <w:rPr>
           <w:rFonts w:ascii="Times New Roman" w:hAnsi="Times New Roman"/>
-          <w:color w:val="000000"/>
-          <w:spacing w:val="-2"/>
           <w:sz w:val="20"/>
-          <w:lang w:val="en-GB"/>
-        </w:rPr>
-        <w:t>Best model: random_forest, selected by CV F1=0.6641. Its advantage over LogisticRegression (CV F1=0.6602) was small (delta=0.0039); the two models are comparable in discriminative power. The Dummy baseline (F1=0.2351) confirms a no-information classifier performs well below all meaningful models. LogisticRegression achieves higher recall (0.849 vs 0.715) at the cost of lower precision (0.540 vs 0.620). Test F1 (0.6631) closely matches CV F1 (0.6641), indicating stable generalisation.</w:t>
+        </w:rPr>
+        <w:t>RandomForest is selected by mean CV F1=0.6641, but its advantage over LogisticRegression (CV F1=0.6602) is small (delta=0.0039). The two models therefore have similar overall discriminative ability, while their operating points differ. LogisticRegression has higher minority recall (0.849 versus 0.715) but lower precision (0.540 versus 0.620), so it would be preferable when missed positive cases are especially costly. RandomForest offers a more balanced precision-recall result and is the selected default under the F1 criterion. GradientBoosting obtains the highest accuracy and ROC-AUC, yet its lower recall reduces F1; this illustrates why accuracy alone would be a poor selection rule under imbalance. The test F1 of 0.6631 is close to the CV F1 of 0.6641, providing no obvious sign of overfitting. A limitation is that the hyperparameters are sensible defaults rather than tuned values; future work could evaluate threshold selection or nested tuning inside cross-validation.</w:t>
       </w:r>
     </w:p>
     <w:p>
@@ -492,10 +478,10 @@
       </w:pPr>
       <w:r>
         <w:rPr>
-          <w:color w:val="000000"/>
-          <w:lang w:val="en-GB"/>
-        </w:rPr>
-        <w:t>The SKILL successfully builds a reusable, leakage-safe tabular classification pipeline. RandomForest was selected as the best model by CV F1, though the margin over LogisticRegression was small. All numerical values are pulled from results.json.</w:t>
+          <w:rFonts w:ascii="Times New Roman" w:hAnsi="Times New Roman"/>
+          <w:sz w:val="20"/>
+        </w:rPr>
+        <w:t>The SKILL produces a reproducible classification workflow that handles missing values and mixed numeric and categorical predictors without leakage. RandomForest is the best model under the stated mean-CV-F1 criterion, although LogisticRegression is a credible alternative when recall is prioritised. The held-out results remain close to cross-validation estimates, and the confusion matrix confirms useful detection of both classes. All reported values are generated from the structured profiling and evaluation outputs.</w:t>
       </w:r>
     </w:p>
     <w:p>
@@ -580,6 +566,14 @@
         <w:t>[1]</w:t>
         <w:tab/>
         <w:t>Pedregosa, F. et al. (2011). Scikit-learn: Machine Learning in Python. Journal of Machine Learning Research, 12, 2825-2830.</w:t>
+      </w:r>
+    </w:p>
+    <w:p>
+      <w:pPr/>
+      <w:r>
+        <w:t>[3]</w:t>
+        <w:tab/>
+        <w:t>McKinney, W. (2010). Data Structures for Statistical Computing in Python. Proceedings of the 9th Python in Science Conference, 56-61.</w:t>
       </w:r>
     </w:p>
     <w:p>

</xml_diff>

<commit_message>
Correct report LLM metadata
</commit_message>
<xml_diff>
--- a/final_report.docx
+++ b/final_report.docx
@@ -644,11 +644,7 @@
         <w:jc w:val="left"/>
       </w:pPr>
       <w:r>
-        <w:rPr>
-          <w:rFonts w:ascii="Times New Roman" w:hAnsi="Times New Roman"/>
-          <w:sz w:val="20"/>
-        </w:rPr>
-        <w:t>Model (LLM): GLM-5.2</w:t>
+        <w:t>Model (LLM): GPT-6</w:t>
       </w:r>
     </w:p>
     <w:p>
@@ -657,11 +653,7 @@
         <w:jc w:val="left"/>
       </w:pPr>
       <w:r>
-        <w:rPr>
-          <w:rFonts w:ascii="Times New Roman" w:hAnsi="Times New Roman"/>
-          <w:sz w:val="20"/>
-        </w:rPr>
-        <w:t>LLM interface: TraeCode (Codex)</w:t>
+        <w:t>LLM interface: Codex desktop</w:t>
       </w:r>
     </w:p>
     <w:p>

</xml_diff>

<commit_message>
Match assignment metadata and refresh submission PDF
</commit_message>
<xml_diff>
--- a/final_report.docx
+++ b/final_report.docx
@@ -35,14 +35,11 @@
         </w:rPr>
       </w:pPr>
       <w:r>
-        <w:rPr>
-          <w:rFonts w:ascii="Times New Roman" w:hAnsi="Times New Roman"/>
-          <w:color w:val="000000"/>
-          <w:lang w:val="en-GB"/>
-        </w:rPr>
         <w:t>LIN TONG, G2608825L</w:t>
         <w:br/>
-        <w:t>IN6227-2023-Assignment-1</w:t>
+        <w:t>IN6227-Assignment-1</w:t>
+        <w:br/>
+        <w:t>Variant-2</w:t>
       </w:r>
     </w:p>
     <w:p>
@@ -631,11 +628,7 @@
         <w:jc w:val="left"/>
       </w:pPr>
       <w:r>
-        <w:rPr>
-          <w:rFonts w:ascii="Times New Roman" w:hAnsi="Times New Roman"/>
-          <w:sz w:val="20"/>
-        </w:rPr>
-        <w:t>Assignment: IN6227-2023-Assignment-1, Variant 2</w:t>
+        <w:t>Assignment: IN6227-Assignment-1, Variant-2</w:t>
       </w:r>
     </w:p>
     <w:p>

</xml_diff>

<commit_message>
Add model configuration details to report
</commit_message>
<xml_diff>
--- a/final_report.docx
+++ b/final_report.docx
@@ -207,11 +207,7 @@
         </w:rPr>
       </w:pPr>
       <w:r>
-        <w:rPr>
-          <w:rFonts w:ascii="Times New Roman" w:hAnsi="Times New Roman"/>
-          <w:sz w:val="20"/>
-        </w:rPr>
-        <w:t>All learned preprocessing is embedded inside an sklearn Pipeline and ColumnTransformer, so imputation, scaling, and encoding are refit within each training fold. Numeric columns use median imputation followed by standard scaling; categorical columns use most-frequent imputation followed by one-hot encoding with handle_unknown="ignore". All 15 original features are retained. No feature is selected using the test set, and no additional feature engineering is imposed because the data already includes the derived composite_rank field. Four classifiers are trained: DummyClassifier with a stratified strategy as the no-information baseline, LogisticRegression for an interpretable linear benchmark, RandomForest for nonlinear interactions, and GradientBoosting as a strong tabular baseline. Stratified five-fold cross-validation with shuffle=True and random_state=42 preserves the class ratio. Mean CV F1 is the primary selection metric; ROC-AUC and PR-AUC provide additional ranking evidence. The selected model is retrained on all training rows and evaluated once on the held-out test set. Balanced class weights are used for LogisticRegression and RandomForest because the minority class is about one quarter of the data.</w:t>
+        <w:t>All learned preprocessing is embedded inside an sklearn Pipeline and ColumnTransformer, so imputation, scaling, and encoding are refit within each training fold. Numeric columns use median imputation followed by standard scaling; categorical columns use most-frequent imputation followed by one-hot encoding with handle_unknown="ignore". All 15 original features are retained. No feature is selected using the test set, and no additional feature engineering is imposed because the data already includes the derived composite_rank field. Four classifiers are trained: DummyClassifier with a stratified strategy as the no-information baseline, LogisticRegression for an interpretable linear benchmark, RandomForest for nonlinear interactions, and GradientBoosting as a strong tabular baseline. Stratified five-fold cross-validation with shuffle=True and random_state=42 preserves the class ratio. Mean CV F1 is the primary selection metric; ROC-AUC and PR-AUC provide additional ranking evidence. The selected model is retrained on all training rows and evaluated once on the held-out test set. Balanced class weights are used for LogisticRegression and RandomForest because the minority class is about one quarter of the data. The model settings were kept deliberately modest: LogisticRegression used max_iter=1000 with class_weight=balanced; RandomForest used 200 trees with class_weight=balanced; GradientBoosting used 100 estimators; and DummyClassifier used the stratified strategy. I did not tune on the test set. The only stopping condition for the iterative logistic model was convergence before max_iter; the tree ensembles used their fixed estimator counts. This makes the comparison reproducible, although a future version could perform a small grid search inside the training folds.</w:t>
       </w:r>
     </w:p>
     <w:p>

</xml_diff>

<commit_message>
Add supporting evaluation figures to report
</commit_message>
<xml_diff>
--- a/final_report.docx
+++ b/final_report.docx
@@ -355,6 +355,106 @@
           <w:sz w:val="18"/>
         </w:rPr>
         <w:t>Figure 1. Test-set confusion matrix.</w:t>
+      </w:r>
+    </w:p>
+    <w:p>
+      <w:pPr>
+        <w:jc w:val="center"/>
+      </w:pPr>
+      <w:r>
+        <w:drawing>
+          <wp:inline xmlns:a="http://schemas.openxmlformats.org/drawingml/2006/main" xmlns:pic="http://schemas.openxmlformats.org/drawingml/2006/picture">
+            <wp:extent cx="2148840" cy="1289304"/>
+            <wp:docPr id="2" name="Picture 2"/>
+            <wp:cNvGraphicFramePr>
+              <a:graphicFrameLocks noChangeAspect="1"/>
+            </wp:cNvGraphicFramePr>
+            <a:graphic>
+              <a:graphicData uri="http://schemas.openxmlformats.org/drawingml/2006/picture">
+                <pic:pic>
+                  <pic:nvPicPr>
+                    <pic:cNvPr id="0" name="target_distribution.png"/>
+                    <pic:cNvPicPr/>
+                  </pic:nvPicPr>
+                  <pic:blipFill>
+                    <a:blip r:embed="rId17"/>
+                    <a:stretch>
+                      <a:fillRect/>
+                    </a:stretch>
+                  </pic:blipFill>
+                  <pic:spPr>
+                    <a:xfrm>
+                      <a:off x="0" y="0"/>
+                      <a:ext cx="2148840" cy="1289304"/>
+                    </a:xfrm>
+                    <a:prstGeom prst="rect"/>
+                  </pic:spPr>
+                </pic:pic>
+              </a:graphicData>
+            </a:graphic>
+          </wp:inline>
+        </w:drawing>
+      </w:r>
+    </w:p>
+    <w:p>
+      <w:pPr>
+        <w:jc w:val="center"/>
+      </w:pPr>
+      <w:r>
+        <w:rPr>
+          <w:sz w:val="16"/>
+        </w:rPr>
+        <w:t>Figure 2. Target class distribution.</w:t>
+      </w:r>
+    </w:p>
+    <w:p>
+      <w:pPr>
+        <w:jc w:val="center"/>
+      </w:pPr>
+      <w:r>
+        <w:drawing>
+          <wp:inline xmlns:a="http://schemas.openxmlformats.org/drawingml/2006/main" xmlns:pic="http://schemas.openxmlformats.org/drawingml/2006/picture">
+            <wp:extent cx="2148840" cy="1880235"/>
+            <wp:docPr id="3" name="Picture 3"/>
+            <wp:cNvGraphicFramePr>
+              <a:graphicFrameLocks noChangeAspect="1"/>
+            </wp:cNvGraphicFramePr>
+            <a:graphic>
+              <a:graphicData uri="http://schemas.openxmlformats.org/drawingml/2006/picture">
+                <pic:pic>
+                  <pic:nvPicPr>
+                    <pic:cNvPr id="0" name="roc_curve.png"/>
+                    <pic:cNvPicPr/>
+                  </pic:nvPicPr>
+                  <pic:blipFill>
+                    <a:blip r:embed="rId18"/>
+                    <a:stretch>
+                      <a:fillRect/>
+                    </a:stretch>
+                  </pic:blipFill>
+                  <pic:spPr>
+                    <a:xfrm>
+                      <a:off x="0" y="0"/>
+                      <a:ext cx="2148840" cy="1880235"/>
+                    </a:xfrm>
+                    <a:prstGeom prst="rect"/>
+                  </pic:spPr>
+                </pic:pic>
+              </a:graphicData>
+            </a:graphic>
+          </wp:inline>
+        </w:drawing>
+      </w:r>
+    </w:p>
+    <w:p>
+      <w:pPr>
+        <w:jc w:val="center"/>
+      </w:pPr>
+      <w:r>
+        <w:rPr>
+          <w:sz w:val="16"/>
+        </w:rPr>
+        <w:t>Figure 3. ROC curve for the selected model.</w:t>
       </w:r>
     </w:p>
     <w:p>

</xml_diff>

<commit_message>
Complete report details and chart labels
</commit_message>
<xml_diff>
--- a/final_report.docx
+++ b/final_report.docx
@@ -127,11 +127,7 @@
         </w:rPr>
       </w:pPr>
       <w:r>
-        <w:rPr>
-          <w:rFonts w:ascii="Times New Roman" w:hAnsi="Times New Roman"/>
-          <w:sz w:val="20"/>
-        </w:rPr>
-        <w:t>This report presents an end-to-end tabular classification workflow applied to the dataset (31,112 rows, 15 features). The target variable is label with two classes: no and yes. The training distribution is no=23,645 and yes=7,464, giving a 3.168:1 imbalance. The data contains 50 missing feature values and three missing target labels; rows with missing labels were removed before training. There are seven numeric and eight categorical predictors, with no duplicate rows. The objective is to build a leakage-safe, reproducible pipeline and compare transparent linear and nonlinear classifiers under the same evaluation protocol.</w:t>
+        <w:t>This report presents an end-to-end tabular classification workflow applied to the dataset (31,112 rows, 15 features). The target variable is label with two classes: no and yes. The training distribution is no=23,645 and yes=7,464, giving a 3.168:1 imbalance. The data contains 50 missing feature values and three missing target labels; rows with missing labels were removed before training. There are seven numeric and eight categorical predictors, with no duplicate rows. The objective is to build a leakage-safe, reproducible pipeline and compare transparent linear and nonlinear classifiers under the same evaluation protocol. After removing three rows with missing targets, 31,109 training rows remained; the held-out test set contained 13,333 rows.</w:t>
       </w:r>
     </w:p>
     <w:p>
@@ -207,7 +203,7 @@
         </w:rPr>
       </w:pPr>
       <w:r>
-        <w:t>All learned preprocessing is embedded inside an sklearn Pipeline and ColumnTransformer, so imputation, scaling, and encoding are refit within each training fold. Numeric columns use median imputation followed by standard scaling; categorical columns use most-frequent imputation followed by one-hot encoding with handle_unknown="ignore". All 15 original features are retained. No feature is selected using the test set, and no additional feature engineering is imposed because the data already includes the derived composite_rank field. Four classifiers are trained: DummyClassifier with a stratified strategy as the no-information baseline, LogisticRegression for an interpretable linear benchmark, RandomForest for nonlinear interactions, and GradientBoosting as a strong tabular baseline. Stratified five-fold cross-validation with shuffle=True and random_state=42 preserves the class ratio. Mean CV F1 is the primary selection metric; ROC-AUC and PR-AUC provide additional ranking evidence. The selected model is retrained on all training rows and evaluated once on the held-out test set. Balanced class weights are used for LogisticRegression and RandomForest because the minority class is about one quarter of the data. The model settings were kept deliberately modest: LogisticRegression used max_iter=1000 with class_weight=balanced; RandomForest used 200 trees with class_weight=balanced; GradientBoosting used 100 estimators; and DummyClassifier used the stratified strategy. I did not tune on the test set. The only stopping condition for the iterative logistic model was convergence before max_iter; the tree ensembles used their fixed estimator counts. This makes the comparison reproducible, although a future version could perform a small grid search inside the training folds.</w:t>
+        <w:t>All learned preprocessing is embedded inside an sklearn Pipeline and ColumnTransformer, so imputation, scaling, and encoding are refit within each training fold. Numeric columns use median imputation followed by standard scaling; categorical columns use most-frequent imputation followed by one-hot encoding with handle_unknown="ignore". All 15 original features are retained. No feature is selected using the test set, and no additional feature engineering is imposed because the data already includes the derived composite_rank field. Four classifiers are trained: DummyClassifier with a stratified strategy as the no-information baseline, LogisticRegression for an interpretable linear benchmark, RandomForest for nonlinear interactions, and GradientBoosting as a strong tabular baseline. Stratified five-fold cross-validation with shuffle=True and random_state=42 preserves the class ratio. Mean CV F1 is the primary selection metric; ROC-AUC and PR-AUC provide additional ranking evidence. The selected model is retrained on all training rows and evaluated once on the held-out test set. Balanced class weights are used for LogisticRegression and RandomForest because the minority class is about one quarter of the data. The model settings were kept deliberately modest: LogisticRegression used max_iter=1000 with class_weight=balanced; RandomForest used 200 trees with class_weight=balanced; GradientBoosting used 100 estimators; and DummyClassifier used the stratified strategy. I did not tune on the test set. The only stopping condition for the iterative logistic model was convergence before max_iter; the tree ensembles used their fixed estimator counts. This makes the comparison reproducible, although a future version could perform a small grid search inside the training folds. No rows were removed as outliers because the numeric variables did not show clearly invalid values; the original observations were retained.</w:t>
       </w:r>
     </w:p>
     <w:p>
@@ -263,11 +259,7 @@
         </w:rPr>
       </w:pPr>
       <w:r>
-        <w:rPr>
-          <w:rFonts w:ascii="Times New Roman" w:hAnsi="Times New Roman"/>
-          <w:sz w:val="20"/>
-        </w:rPr>
-        <w:t>Test-set performance for the selected RandomForest is accuracy=0.8272, precision=0.6177, recall=0.7156, F1=0.6631, ROC-AUC=0.8887, and PR-AUC=0.7010. The CV comparison is: DummyClassifier accuracy=0.635 and F1=0.235; LogisticRegression accuracy=0.790 and F1=0.660; RandomForest accuracy=0.827 and F1=0.664; GradientBoosting accuracy=0.839 and F1=0.626. The test confusion matrix contains 8,762 true negatives, 1,403 false positives, 901 false negatives, and 2,267 true positives. The figure shows that the model identifies most minority-class cases while retaining a moderate false-positive count.</w:t>
+        <w:t>Test-set performance for the selected RandomForest is accuracy=0.8272, precision=0.6177, recall=0.7156, F1=0.6631, ROC-AUC=0.8887, and PR-AUC=0.7010. The CV comparison is: DummyClassifier accuracy=0.635 and F1=0.235; LogisticRegression accuracy=0.790 and F1=0.660; RandomForest accuracy=0.827 and F1=0.664; GradientBoosting accuracy=0.839 and F1=0.626. The test confusion matrix contains 8,762 true negatives, 1,403 false positives, 901 false negatives, and 2,267 true positives. The figure shows that the model identifies most minority-class cases while retaining a moderate false-positive count. GradientBoosting had the highest CV ROC-AUC (0.8913) and PR-AUC (0.7131), but its recall was lower and its F1 (0.6260) was below RandomForest (0.6641).</w:t>
       </w:r>
     </w:p>
     <w:p>

</xml_diff>

<commit_message>
Normalize report figure caption typography
</commit_message>
<xml_diff>
--- a/final_report.docx
+++ b/final_report.docx
@@ -394,7 +394,8 @@
       </w:pPr>
       <w:r>
         <w:rPr>
-          <w:sz w:val="16"/>
+          <w:rFonts w:ascii="Times New Roman" w:hAnsi="Times New Roman"/>
+          <w:sz w:val="18"/>
         </w:rPr>
         <w:t>Figure 2. Target class distribution.</w:t>
       </w:r>
@@ -444,7 +445,8 @@
       </w:pPr>
       <w:r>
         <w:rPr>
-          <w:sz w:val="16"/>
+          <w:rFonts w:ascii="Times New Roman" w:hAnsi="Times New Roman"/>
+          <w:sz w:val="18"/>
         </w:rPr>
         <w:t>Figure 3. ROC curve for the selected model.</w:t>
       </w:r>

</xml_diff>

<commit_message>
Unify report typography across both pages
</commit_message>
<xml_diff>
--- a/final_report.docx
+++ b/final_report.docx
@@ -15,7 +15,8 @@
       </w:pPr>
       <w:r>
         <w:rPr>
-          <w:rFonts w:ascii="Times New Roman" w:hAnsi="Times New Roman"/>
+          <w:rFonts w:ascii="Times New Roman" w:hAnsi="Times New Roman" w:eastAsia="Times New Roman"/>
+          <w:b/>
           <w:color w:val="000000"/>
           <w:sz w:val="48"/>
           <w:szCs w:val="48"/>
@@ -35,6 +36,11 @@
         </w:rPr>
       </w:pPr>
       <w:r>
+        <w:rPr>
+          <w:rFonts w:ascii="Times New Roman" w:hAnsi="Times New Roman" w:eastAsia="Times New Roman"/>
+          <w:b w:val="0"/>
+          <w:sz w:val="24"/>
+        </w:rPr>
         <w:t>LIN TONG, G2608825L</w:t>
         <w:br/>
         <w:t>IN6227-Assignment-1</w:t>
@@ -95,16 +101,107 @@
       <w:bookmarkStart w:id="0" w:name="_Hlk504674043"/>
       <w:r>
         <w:rPr>
+          <w:rFonts w:ascii="Times New Roman" w:hAnsi="Times New Roman" w:eastAsia="Times New Roman"/>
+          <w:b/>
+          <w:color w:val="000000"/>
+          <w:sz w:val="20"/>
+          <w:lang w:val="en-GB"/>
+        </w:rPr>
+        <w:t>INTRODUCTION</w:t>
+      </w:r>
+    </w:p>
+    <w:bookmarkEnd w:id="0"/>
+    <w:p>
+      <w:pPr>
+        <w:pStyle w:val="PARAGRAPHnoindent"/>
+        <w:rPr>
+          <w:rFonts w:ascii="Times New Roman" w:hAnsi="Times New Roman"/>
+          <w:color w:val="000000"/>
+          <w:sz w:val="20"/>
+          <w:lang w:val="en-GB"/>
+        </w:rPr>
+      </w:pPr>
+    </w:p>
+    <w:p>
+      <w:pPr>
+        <w:pStyle w:val="PARAGRAPHnoindent"/>
+        <w:rPr>
+          <w:rFonts w:ascii="Times New Roman" w:hAnsi="Times New Roman"/>
+          <w:color w:val="000000"/>
+          <w:sz w:val="20"/>
+          <w:lang w:val="en-GB"/>
+        </w:rPr>
+      </w:pPr>
+      <w:r>
+        <w:rPr>
+          <w:rFonts w:ascii="Times New Roman" w:hAnsi="Times New Roman" w:eastAsia="Times New Roman"/>
+          <w:sz w:val="20"/>
+        </w:rPr>
+        <w:t>This report presents an end-to-end tabular classification workflow applied to the dataset (31,112 rows, 15 features). The target variable is label with two classes: no and yes. The training distribution is no=23,645 and yes=7,464, giving a 3.168:1 imbalance. The data contains 50 missing feature values and three missing target labels; rows with missing labels were removed before training. There are seven numeric and eight categorical predictors, with no duplicate rows. The objective is to build a leakage-safe, reproducible pipeline and compare transparent linear and nonlinear classifiers under the same evaluation protocol. After removing three rows with missing targets, 31,109 training rows remained; the held-out test set contained 13,333 rows.</w:t>
+      </w:r>
+    </w:p>
+    <w:p>
+      <w:pPr>
+        <w:pStyle w:val="PARAGRAPH"/>
+        <w:rPr>
+          <w:rFonts w:ascii="Times New Roman" w:hAnsi="Times New Roman"/>
+          <w:sz w:val="20"/>
+          <w:lang w:val="en-GB"/>
+        </w:rPr>
+      </w:pPr>
+      <w:r>
+        <w:rPr>
+          <w:rFonts w:ascii="Times New Roman" w:hAnsi="Times New Roman" w:eastAsia="Times New Roman"/>
+          <w:sz w:val="20"/>
+          <w:lang w:val="en-GB"/>
+        </w:rPr>
+      </w:r>
+    </w:p>
+    <w:p>
+      <w:pPr>
+        <w:pStyle w:val="PARAGRAPH"/>
+        <w:ind w:firstLine="0"/>
+        <w:rPr>
+          <w:rFonts w:ascii="Times New Roman" w:hAnsi="Times New Roman"/>
+          <w:sz w:val="20"/>
+          <w:lang w:val="en-GB"/>
+        </w:rPr>
+      </w:pPr>
+      <w:bookmarkStart w:id="1" w:name="_Hlk504764255"/>
+    </w:p>
+    <w:bookmarkEnd w:id="1"/>
+    <w:p>
+      <w:pPr>
+        <w:pStyle w:val="PARAGRAPHnoindent"/>
+        <w:outlineLvl w:val="0"/>
+        <w:rPr>
           <w:rFonts w:ascii="Times New Roman" w:hAnsi="Times New Roman"/>
           <w:b/>
           <w:color w:val="000000"/>
           <w:sz w:val="20"/>
           <w:lang w:val="en-GB"/>
         </w:rPr>
-        <w:t>INTRODUCTION</w:t>
+      </w:pPr>
+      <w:r>
+        <w:rPr>
+          <w:rFonts w:ascii="Times New Roman" w:hAnsi="Times New Roman" w:eastAsia="Times New Roman"/>
+          <w:b/>
+          <w:color w:val="000000"/>
+          <w:sz w:val="20"/>
+          <w:lang w:val="en-GB"/>
+        </w:rPr>
+        <w:t>METHODS OR PROCEDURES</w:t>
       </w:r>
     </w:p>
-    <w:bookmarkEnd w:id="0"/>
+    <w:p>
+      <w:pPr>
+        <w:pStyle w:val="PARAGRAPH"/>
+        <w:rPr>
+          <w:rFonts w:ascii="Times New Roman" w:hAnsi="Times New Roman"/>
+          <w:lang w:val="en-GB"/>
+        </w:rPr>
+      </w:pPr>
+    </w:p>
     <w:p>
       <w:pPr>
         <w:pStyle w:val="PARAGRAPHnoindent"/>
@@ -115,126 +212,43 @@
           <w:lang w:val="en-GB"/>
         </w:rPr>
       </w:pPr>
-    </w:p>
-    <w:p>
-      <w:pPr>
-        <w:pStyle w:val="PARAGRAPHnoindent"/>
-        <w:rPr>
-          <w:rFonts w:ascii="Times New Roman" w:hAnsi="Times New Roman"/>
-          <w:color w:val="000000"/>
+      <w:r>
+        <w:rPr>
+          <w:rFonts w:ascii="Times New Roman" w:hAnsi="Times New Roman" w:eastAsia="Times New Roman"/>
           <w:sz w:val="20"/>
-          <w:lang w:val="en-GB"/>
-        </w:rPr>
-      </w:pPr>
-      <w:r>
-        <w:t>This report presents an end-to-end tabular classification workflow applied to the dataset (31,112 rows, 15 features). The target variable is label with two classes: no and yes. The training distribution is no=23,645 and yes=7,464, giving a 3.168:1 imbalance. The data contains 50 missing feature values and three missing target labels; rows with missing labels were removed before training. There are seven numeric and eight categorical predictors, with no duplicate rows. The objective is to build a leakage-safe, reproducible pipeline and compare transparent linear and nonlinear classifiers under the same evaluation protocol. After removing three rows with missing targets, 31,109 training rows remained; the held-out test set contained 13,333 rows.</w:t>
+        </w:rPr>
+        <w:t>All learned preprocessing is embedded inside an sklearn Pipeline and ColumnTransformer, so imputation, scaling, and encoding are refit within each training fold. Numeric columns use median imputation followed by standard scaling; categorical columns use most-frequent imputation followed by one-hot encoding with handle_unknown="ignore". All 15 original features are retained. No feature is selected using the test set, and no additional feature engineering is imposed because the data already includes the derived composite_rank field. Four classifiers are trained: DummyClassifier with a stratified strategy as the no-information baseline, LogisticRegression for an interpretable linear benchmark, RandomForest for nonlinear interactions, and GradientBoosting as a strong tabular baseline. Stratified five-fold cross-validation with shuffle=True and random_state=42 preserves the class ratio. Mean CV F1 is the primary selection metric; ROC-AUC and PR-AUC provide additional ranking evidence. The selected model is retrained on all training rows and evaluated once on the held-out test set. Balanced class weights are used for LogisticRegression and RandomForest because the minority class is about one quarter of the data. The model settings were kept deliberately modest: LogisticRegression used max_iter=1000 with class_weight=balanced; RandomForest used 200 trees with class_weight=balanced; GradientBoosting used 100 estimators; and DummyClassifier used the stratified strategy. I did not tune on the test set. The only stopping condition for the iterative logistic model was convergence before max_iter; the tree ensembles used their fixed estimator counts. This makes the comparison reproducible, although a future version could perform a small grid search inside the training folds. No rows were removed as outliers because the numeric variables did not show clearly invalid values; the original observations were retained.</w:t>
       </w:r>
     </w:p>
     <w:p>
       <w:pPr>
         <w:pStyle w:val="PARAGRAPH"/>
+        <w:ind w:firstLine="0"/>
         <w:rPr>
           <w:rFonts w:ascii="Times New Roman" w:hAnsi="Times New Roman"/>
-          <w:sz w:val="20"/>
           <w:lang w:val="en-GB"/>
         </w:rPr>
       </w:pPr>
-      <w:r>
-        <w:rPr>
-          <w:rFonts w:ascii="Times New Roman" w:hAnsi="Times New Roman"/>
-          <w:sz w:val="20"/>
-          <w:lang w:val="en-GB"/>
-        </w:rPr>
-      </w:r>
     </w:p>
     <w:p>
       <w:pPr>
         <w:pStyle w:val="PARAGRAPH"/>
         <w:ind w:firstLine="0"/>
+        <w:outlineLvl w:val="0"/>
         <w:rPr>
           <w:rFonts w:ascii="Times New Roman" w:hAnsi="Times New Roman"/>
-          <w:sz w:val="20"/>
+          <w:b/>
           <w:lang w:val="en-GB"/>
         </w:rPr>
       </w:pPr>
-      <w:bookmarkStart w:id="1" w:name="_Hlk504764255"/>
-    </w:p>
-    <w:bookmarkEnd w:id="1"/>
-    <w:p>
-      <w:pPr>
-        <w:pStyle w:val="PARAGRAPHnoindent"/>
-        <w:outlineLvl w:val="0"/>
-        <w:rPr>
-          <w:rFonts w:ascii="Times New Roman" w:hAnsi="Times New Roman"/>
+      <w:r>
+        <w:rPr>
+          <w:rFonts w:ascii="Times New Roman" w:hAnsi="Times New Roman" w:eastAsia="Times New Roman"/>
           <w:b/>
           <w:color w:val="000000"/>
           <w:sz w:val="20"/>
           <w:lang w:val="en-GB"/>
         </w:rPr>
-      </w:pPr>
-      <w:r>
-        <w:rPr>
-          <w:rFonts w:ascii="Times New Roman" w:hAnsi="Times New Roman"/>
-          <w:b/>
-          <w:color w:val="000000"/>
-          <w:sz w:val="20"/>
-          <w:lang w:val="en-GB"/>
-        </w:rPr>
-        <w:t>METHODS OR PROCEDURES</w:t>
-      </w:r>
-    </w:p>
-    <w:p>
-      <w:pPr>
-        <w:pStyle w:val="PARAGRAPH"/>
-        <w:rPr>
-          <w:rFonts w:ascii="Times New Roman" w:hAnsi="Times New Roman"/>
-          <w:lang w:val="en-GB"/>
-        </w:rPr>
-      </w:pPr>
-    </w:p>
-    <w:p>
-      <w:pPr>
-        <w:pStyle w:val="PARAGRAPHnoindent"/>
-        <w:rPr>
-          <w:rFonts w:ascii="Times New Roman" w:hAnsi="Times New Roman"/>
-          <w:color w:val="000000"/>
-          <w:sz w:val="20"/>
-          <w:lang w:val="en-GB"/>
-        </w:rPr>
-      </w:pPr>
-      <w:r>
-        <w:t>All learned preprocessing is embedded inside an sklearn Pipeline and ColumnTransformer, so imputation, scaling, and encoding are refit within each training fold. Numeric columns use median imputation followed by standard scaling; categorical columns use most-frequent imputation followed by one-hot encoding with handle_unknown="ignore". All 15 original features are retained. No feature is selected using the test set, and no additional feature engineering is imposed because the data already includes the derived composite_rank field. Four classifiers are trained: DummyClassifier with a stratified strategy as the no-information baseline, LogisticRegression for an interpretable linear benchmark, RandomForest for nonlinear interactions, and GradientBoosting as a strong tabular baseline. Stratified five-fold cross-validation with shuffle=True and random_state=42 preserves the class ratio. Mean CV F1 is the primary selection metric; ROC-AUC and PR-AUC provide additional ranking evidence. The selected model is retrained on all training rows and evaluated once on the held-out test set. Balanced class weights are used for LogisticRegression and RandomForest because the minority class is about one quarter of the data. The model settings were kept deliberately modest: LogisticRegression used max_iter=1000 with class_weight=balanced; RandomForest used 200 trees with class_weight=balanced; GradientBoosting used 100 estimators; and DummyClassifier used the stratified strategy. I did not tune on the test set. The only stopping condition for the iterative logistic model was convergence before max_iter; the tree ensembles used their fixed estimator counts. This makes the comparison reproducible, although a future version could perform a small grid search inside the training folds. No rows were removed as outliers because the numeric variables did not show clearly invalid values; the original observations were retained.</w:t>
-      </w:r>
-    </w:p>
-    <w:p>
-      <w:pPr>
-        <w:pStyle w:val="PARAGRAPH"/>
-        <w:ind w:firstLine="0"/>
-        <w:rPr>
-          <w:rFonts w:ascii="Times New Roman" w:hAnsi="Times New Roman"/>
-          <w:lang w:val="en-GB"/>
-        </w:rPr>
-      </w:pPr>
-    </w:p>
-    <w:p>
-      <w:pPr>
-        <w:pStyle w:val="PARAGRAPH"/>
-        <w:ind w:firstLine="0"/>
-        <w:outlineLvl w:val="0"/>
-        <w:rPr>
-          <w:rFonts w:ascii="Times New Roman" w:hAnsi="Times New Roman"/>
-          <w:b/>
-          <w:lang w:val="en-GB"/>
-        </w:rPr>
-      </w:pPr>
-      <w:r>
-        <w:rPr>
-          <w:rFonts w:ascii="Times New Roman" w:hAnsi="Times New Roman"/>
-          <w:b/>
-          <w:color w:val="000000"/>
-          <w:sz w:val="20"/>
-          <w:lang w:val="en-GB"/>
-        </w:rPr>
         <w:t>RESULTS</w:t>
       </w:r>
     </w:p>
@@ -259,6 +273,10 @@
         </w:rPr>
       </w:pPr>
       <w:r>
+        <w:rPr>
+          <w:rFonts w:ascii="Times New Roman" w:hAnsi="Times New Roman" w:eastAsia="Times New Roman"/>
+          <w:sz w:val="20"/>
+        </w:rPr>
         <w:t>Test-set performance for the selected RandomForest is accuracy=0.8272, precision=0.6177, recall=0.7156, F1=0.6631, ROC-AUC=0.8887, and PR-AUC=0.7010. The CV comparison is: DummyClassifier accuracy=0.635 and F1=0.235; LogisticRegression accuracy=0.790 and F1=0.660; RandomForest accuracy=0.827 and F1=0.664; GradientBoosting accuracy=0.839 and F1=0.626. The test confusion matrix contains 8,762 true negatives, 1,403 false positives, 901 false negatives, and 2,267 true positives. The figure shows that the model identifies most minority-class cases while retaining a moderate false-positive count. GradientBoosting had the highest CV ROC-AUC (0.8913) and PR-AUC (0.7131), but its recall was lower and its F1 (0.6260) was below RandomForest (0.6641).</w:t>
       </w:r>
     </w:p>
@@ -274,7 +292,7 @@
       </w:pPr>
       <w:r>
         <w:rPr>
-          <w:rFonts w:ascii="Times New Roman" w:hAnsi="Times New Roman"/>
+          <w:rFonts w:ascii="Times New Roman" w:hAnsi="Times New Roman" w:eastAsia="Times New Roman"/>
           <w:color w:val="000000"/>
           <w:sz w:val="20"/>
           <w:lang w:val="en-GB"/>
@@ -301,6 +319,10 @@
         <w:jc w:val="center"/>
       </w:pPr>
       <w:r>
+        <w:rPr>
+          <w:rFonts w:ascii="Times New Roman" w:hAnsi="Times New Roman" w:eastAsia="Times New Roman"/>
+          <w:sz w:val="20"/>
+        </w:rPr>
         <w:drawing>
           <wp:inline xmlns:a="http://schemas.openxmlformats.org/drawingml/2006/main" xmlns:pic="http://schemas.openxmlformats.org/drawingml/2006/picture">
             <wp:extent cx="2148840" cy="1880235"/>
@@ -343,7 +365,8 @@
       </w:pPr>
       <w:r>
         <w:rPr>
-          <w:rFonts w:ascii="Times New Roman" w:hAnsi="Times New Roman"/>
+          <w:rFonts w:ascii="Times New Roman" w:hAnsi="Times New Roman" w:eastAsia="Times New Roman"/>
+          <w:b w:val="0"/>
           <w:sz w:val="18"/>
         </w:rPr>
         <w:t>Figure 1. Test-set confusion matrix.</w:t>
@@ -354,6 +377,10 @@
         <w:jc w:val="center"/>
       </w:pPr>
       <w:r>
+        <w:rPr>
+          <w:rFonts w:ascii="Times New Roman" w:hAnsi="Times New Roman" w:eastAsia="Times New Roman"/>
+          <w:sz w:val="20"/>
+        </w:rPr>
         <w:drawing>
           <wp:inline xmlns:a="http://schemas.openxmlformats.org/drawingml/2006/main" xmlns:pic="http://schemas.openxmlformats.org/drawingml/2006/picture">
             <wp:extent cx="2148840" cy="1289304"/>
@@ -394,7 +421,8 @@
       </w:pPr>
       <w:r>
         <w:rPr>
-          <w:rFonts w:ascii="Times New Roman" w:hAnsi="Times New Roman"/>
+          <w:rFonts w:ascii="Times New Roman" w:hAnsi="Times New Roman" w:eastAsia="Times New Roman"/>
+          <w:b w:val="0"/>
           <w:sz w:val="18"/>
         </w:rPr>
         <w:t>Figure 2. Target class distribution.</w:t>
@@ -405,6 +433,10 @@
         <w:jc w:val="center"/>
       </w:pPr>
       <w:r>
+        <w:rPr>
+          <w:rFonts w:ascii="Times New Roman" w:hAnsi="Times New Roman" w:eastAsia="Times New Roman"/>
+          <w:sz w:val="20"/>
+        </w:rPr>
         <w:drawing>
           <wp:inline xmlns:a="http://schemas.openxmlformats.org/drawingml/2006/main" xmlns:pic="http://schemas.openxmlformats.org/drawingml/2006/picture">
             <wp:extent cx="2148840" cy="1880235"/>
@@ -445,7 +477,8 @@
       </w:pPr>
       <w:r>
         <w:rPr>
-          <w:rFonts w:ascii="Times New Roman" w:hAnsi="Times New Roman"/>
+          <w:rFonts w:ascii="Times New Roman" w:hAnsi="Times New Roman" w:eastAsia="Times New Roman"/>
+          <w:b w:val="0"/>
           <w:sz w:val="18"/>
         </w:rPr>
         <w:t>Figure 3. ROC curve for the selected model.</w:t>
@@ -466,7 +499,8 @@
       <w:bookmarkStart w:id="3" w:name="_Hlk505887282"/>
       <w:r>
         <w:rPr>
-          <w:rFonts w:ascii="Times New Roman" w:hAnsi="Times New Roman"/>
+          <w:rFonts w:ascii="Times New Roman" w:hAnsi="Times New Roman" w:eastAsia="Times New Roman"/>
+          <w:b/>
           <w:color w:val="000000"/>
           <w:sz w:val="20"/>
           <w:lang w:val="en-GB"/>
@@ -475,7 +509,8 @@
       </w:r>
       <w:r>
         <w:rPr>
-          <w:rFonts w:ascii="Times New Roman" w:hAnsi="Times New Roman"/>
+          <w:rFonts w:ascii="Times New Roman" w:hAnsi="Times New Roman" w:eastAsia="Times New Roman"/>
+          <w:b/>
           <w:color w:val="000000"/>
           <w:sz w:val="20"/>
           <w:lang w:val="en-GB"/>
@@ -507,7 +542,7 @@
       </w:pPr>
       <w:r>
         <w:rPr>
-          <w:rFonts w:ascii="Times New Roman" w:hAnsi="Times New Roman"/>
+          <w:rFonts w:ascii="Times New Roman" w:hAnsi="Times New Roman" w:eastAsia="Times New Roman"/>
           <w:sz w:val="20"/>
         </w:rPr>
         <w:t>RandomForest is selected by mean CV F1=0.6641, but its advantage over LogisticRegression (CV F1=0.6602) is small (delta=0.0039). The two models therefore have similar overall discriminative ability, while their operating points differ. LogisticRegression has higher minority recall (0.849 versus 0.715) but lower precision (0.540 versus 0.620), so it would be preferable when missed positive cases are especially costly. RandomForest offers a more balanced precision-recall result and is the selected default under the F1 criterion. GradientBoosting obtains the highest accuracy and ROC-AUC, yet its lower recall reduces F1; this illustrates why accuracy alone would be a poor selection rule under imbalance. The test F1 of 0.6631 is close to the CV F1 of 0.6641, providing no obvious sign of overfitting. A limitation is that the hyperparameters are sensible defaults rather than tuned values; future work could evaluate threshold selection or nested tuning inside cross-validation.</w:t>
@@ -537,8 +572,10 @@
       </w:pPr>
       <w:r>
         <w:rPr>
+          <w:rFonts w:ascii="Times New Roman" w:hAnsi="Times New Roman" w:eastAsia="Times New Roman"/>
           <w:b/>
           <w:color w:val="000000"/>
+          <w:sz w:val="20"/>
           <w:lang w:val="en-GB"/>
         </w:rPr>
         <w:t xml:space="preserve">CONCLUSION </w:t>
@@ -565,7 +602,7 @@
       </w:pPr>
       <w:r>
         <w:rPr>
-          <w:rFonts w:ascii="Times New Roman" w:hAnsi="Times New Roman"/>
+          <w:rFonts w:ascii="Times New Roman" w:hAnsi="Times New Roman" w:eastAsia="Times New Roman"/>
           <w:sz w:val="20"/>
         </w:rPr>
         <w:t>The SKILL produces a reproducible classification workflow that handles missing values and mixed numeric and categorical predictors without leakage. RandomForest is the best model under the stated mean-CV-F1 criterion, although LogisticRegression is a credible alternative when recall is prioritised. The held-out results remain close to cross-validation estimates, and the confusion matrix confirms useful detection of both classes. All reported values are generated from the structured profiling and evaluation outputs.</w:t>
@@ -615,6 +652,7 @@
       </w:pPr>
       <w:r>
         <w:rPr>
+          <w:rFonts w:ascii="Times New Roman" w:hAnsi="Times New Roman" w:eastAsia="Times New Roman"/>
           <w:b/>
           <w:color w:val="000000"/>
           <w:sz w:val="20"/>
@@ -646,6 +684,7 @@
       </w:pPr>
       <w:r>
         <w:rPr>
+          <w:rFonts w:ascii="Times New Roman" w:hAnsi="Times New Roman" w:eastAsia="Times New Roman"/>
           <w:color w:val="000000"/>
           <w:spacing w:val="-8"/>
           <w:sz w:val="20"/>
@@ -658,6 +697,10 @@
     <w:p>
       <w:pPr/>
       <w:r>
+        <w:rPr>
+          <w:rFonts w:ascii="Times New Roman" w:hAnsi="Times New Roman" w:eastAsia="Times New Roman"/>
+          <w:sz w:val="20"/>
+        </w:rPr>
         <w:t>[3]</w:t>
         <w:tab/>
         <w:t>McKinney, W. (2010). Data Structures for Statistical Computing in Python. Proceedings of the 9th Python in Science Conference, 56-61.</w:t>
@@ -676,6 +719,7 @@
       </w:pPr>
       <w:r>
         <w:rPr>
+          <w:rFonts w:ascii="Times New Roman" w:hAnsi="Times New Roman" w:eastAsia="Times New Roman"/>
           <w:color w:val="000000"/>
           <w:spacing w:val="-8"/>
           <w:sz w:val="20"/>
@@ -693,7 +737,7 @@
       </w:pPr>
       <w:r>
         <w:rPr>
-          <w:rFonts w:ascii="Times New Roman" w:hAnsi="Times New Roman"/>
+          <w:rFonts w:ascii="Times New Roman" w:hAnsi="Times New Roman" w:eastAsia="Times New Roman"/>
           <w:sz w:val="20"/>
         </w:rPr>
         <w:t>Name: LIN TONG</w:t>
@@ -706,7 +750,7 @@
       </w:pPr>
       <w:r>
         <w:rPr>
-          <w:rFonts w:ascii="Times New Roman" w:hAnsi="Times New Roman"/>
+          <w:rFonts w:ascii="Times New Roman" w:hAnsi="Times New Roman" w:eastAsia="Times New Roman"/>
           <w:sz w:val="20"/>
         </w:rPr>
         <w:t>Matric number: G2608825L</w:t>
@@ -718,6 +762,10 @@
         <w:jc w:val="left"/>
       </w:pPr>
       <w:r>
+        <w:rPr>
+          <w:rFonts w:ascii="Times New Roman" w:hAnsi="Times New Roman" w:eastAsia="Times New Roman"/>
+          <w:sz w:val="20"/>
+        </w:rPr>
         <w:t>Assignment: IN6227-Assignment-1, Variant-2</w:t>
       </w:r>
     </w:p>
@@ -727,6 +775,10 @@
         <w:jc w:val="left"/>
       </w:pPr>
       <w:r>
+        <w:rPr>
+          <w:rFonts w:ascii="Times New Roman" w:hAnsi="Times New Roman" w:eastAsia="Times New Roman"/>
+          <w:sz w:val="20"/>
+        </w:rPr>
         <w:t>Model (LLM): GPT-6</w:t>
       </w:r>
     </w:p>
@@ -736,6 +788,10 @@
         <w:jc w:val="left"/>
       </w:pPr>
       <w:r>
+        <w:rPr>
+          <w:rFonts w:ascii="Times New Roman" w:hAnsi="Times New Roman" w:eastAsia="Times New Roman"/>
+          <w:sz w:val="20"/>
+        </w:rPr>
         <w:t>LLM interface: Codex desktop</w:t>
       </w:r>
     </w:p>
@@ -755,7 +811,7 @@
       </w:pPr>
       <w:r>
         <w:rPr>
-          <w:rFonts w:ascii="Times New Roman" w:hAnsi="Times New Roman"/>
+          <w:rFonts w:ascii="Times New Roman" w:hAnsi="Times New Roman" w:eastAsia="Times New Roman"/>
           <w:sz w:val="20"/>
         </w:rPr>
         <w:t>GitHub: https://github.com/tonglynn/in6227-tabular-classification-skill</w:t>

</xml_diff>

<commit_message>
Fix duplicate reference numbering
</commit_message>
<xml_diff>
--- a/final_report.docx
+++ b/final_report.docx
@@ -701,7 +701,7 @@
           <w:rFonts w:ascii="Times New Roman" w:hAnsi="Times New Roman" w:eastAsia="Times New Roman"/>
           <w:sz w:val="20"/>
         </w:rPr>
-        <w:t>[3]</w:t>
+        <w:t>[2]</w:t>
         <w:tab/>
         <w:t>McKinney, W. (2010). Data Structures for Statistical Computing in Python. Proceedings of the 9th Python in Science Conference, 56-61.</w:t>
       </w:r>
@@ -720,12 +720,9 @@
       <w:r>
         <w:rPr>
           <w:rFonts w:ascii="Times New Roman" w:hAnsi="Times New Roman" w:eastAsia="Times New Roman"/>
-          <w:color w:val="000000"/>
-          <w:spacing w:val="-8"/>
           <w:sz w:val="20"/>
-          <w:lang w:val="en-US"/>
-        </w:rPr>
-        <w:t>[2]</w:t>
+        </w:rPr>
+        <w:t>[3]</w:t>
         <w:tab/>
         <w:t>Breiman, L. (2001). Random Forests. Machine Learning, 45(1), 5-32.</w:t>
       </w:r>

</xml_diff>